<commit_message>
fix: expandable item table with prices in senior review panel, start v2.0
Co-Authored-By: Claude Sonnet 5.5 <noreply@anthropic.com>
</commit_message>
<xml_diff>
--- a/Historia wersji oraz md/Historia wersji/AMSteel_Quote_Raport_Wersji_2.0.docx
+++ b/Historia wersji oraz md/Historia wersji/AMSteel_Quote_Raport_Wersji_2.0.docx
@@ -115,7 +115,25 @@
           </w:tcPr>
           <w:p>
             <w:r>
-              <w:t>25.09.2026 - ...</w:t>
+              <w:t>2</w:t>
+            </w:r>
+            <w:r>
+              <w:t>4</w:t>
+            </w:r>
+            <w:r>
+              <w:t xml:space="preserve">.09.2026 - </w:t>
+            </w:r>
+            <w:r>
+              <w:t>13</w:t>
+            </w:r>
+            <w:r>
+              <w:t>.</w:t>
+            </w:r>
+            <w:r>
+              <w:t>10</w:t>
+            </w:r>
+            <w:r>
+              <w:t>.2026</w:t>
             </w:r>
           </w:p>
         </w:tc>
@@ -141,7 +159,7 @@
           </w:tcPr>
           <w:p>
             <w:r>
-              <w:t>...</w:t>
+              <w:t>13.10.2026</w:t>
             </w:r>
           </w:p>
         </w:tc>
@@ -262,7 +280,25 @@
           </w:tcPr>
           <w:p>
             <w:r>
-              <w:t>25.09.2026 - ...</w:t>
+              <w:t>2</w:t>
+            </w:r>
+            <w:r>
+              <w:t>4</w:t>
+            </w:r>
+            <w:r>
+              <w:t xml:space="preserve">.09.2026 - </w:t>
+            </w:r>
+            <w:r>
+              <w:t>13</w:t>
+            </w:r>
+            <w:r>
+              <w:t>.</w:t>
+            </w:r>
+            <w:r>
+              <w:t>10</w:t>
+            </w:r>
+            <w:r>
+              <w:t>.2026</w:t>
             </w:r>
           </w:p>
         </w:tc>
@@ -272,7 +308,7 @@
           </w:tcPr>
           <w:p>
             <w:r>
-              <w:t>...</w:t>
+              <w:t>13.10.2026</w:t>
             </w:r>
           </w:p>
         </w:tc>
@@ -281,7 +317,9 @@
             <w:tcW w:w="3678" w:type="dxa"/>
           </w:tcPr>
           <w:p>
-            <w:r/>
+            <w:r>
+              <w:t>Panel Starszego handlowca: liczba pozycji przy ofercie oczekującej na walidację jest teraz klikalna i rozwija pełną tabelę pozycji (gatunek, wymiary, typ, cena, tony, wartość) - tak jak na liście „Moje oferty”.</w:t>
+            </w:r>
           </w:p>
         </w:tc>
       </w:tr>
@@ -325,11 +363,11 @@
           </w:tcPr>
           <w:p>
             <w:r>
-              <w:t xml:space="preserve">Naprawiono podatność XSS w komunikatach ostrzegawczych kalkulatora o grubości/szerokości poza zakresem tabeli - wartości wstawiane do tych komunikatów (wcześniej bez oczyszczenia, przez dangerouslySetInnerHTML) są teraz oczyszczane (funkcja formatWarning w lib/translations.ts). Na liście „Moje oferty” dodano linię z firmą klienta i numerem SAP bezpośrednio pod numerem oferty, nad nazwą własną oferty, z placeholderem dla ofert bez jeszcze uzupełnionych danych klienta; zmiana obejmuje wszystkie 4 języki interfejsu. Wyszukiwarka i sortowanie na liście ofert rozszerzone o firmę klienta i numer SAP ID (dodatkowo w panelach Starszego handlowca i Administratora pojawiło się sortowanie, którego wcześniej tam w ogóle nie było). Plakietka statusu na liście „Moje oferty” skrócona - powód odrzucenia/przegranej pokazuje się teraz zwięźle obok numeru oferty zamiast w osobnym dużym czerwonym bloku pod nazwą firmy. W </w:t>
+              <w:t xml:space="preserve">Naprawiono podatność XSS w komunikatach ostrzegawczych kalkulatora o grubości/szerokości poza zakresem tabeli - wartości wstawiane do tych komunikatów (wcześniej bez oczyszczenia, przez dangerouslySetInnerHTML) są teraz oczyszczane (funkcja formatWarning w lib/translations.ts). Na liście „Moje oferty” dodano linię z firmą klienta i numerem SAP bezpośrednio pod numerem oferty, nad nazwą własną oferty, z placeholderem dla ofert bez jeszcze uzupełnionych danych klienta; zmiana obejmuje wszystkie 4 języki interfejsu. Wyszukiwarka i sortowanie na liście ofert rozszerzone o firmę klienta i numer SAP ID (dodatkowo w panelach Starszego handlowca i Administratora pojawiło się sortowanie, którego wcześniej tam w ogóle nie było). Plakietka statusu na liście „Moje oferty” skrócona - powód odrzucenia/przegranej pokazuje się teraz zwięźle obok numeru oferty </w:t>
             </w:r>
             <w:r>
               <w:lastRenderedPageBreak/>
-              <w:t>Zestawieniu dodano widoczną plakietkę z kosztem transportu pozycji z listy i naprawiono zaniżanie stawki transportu €/t na już dodanych pozycjach, powodowane przez niedodany jeszcze szkic kolejnej pozycji w formularzu kalkulatora. Poprawiono też responsywność całej aplikacji na wąskich ekranach telefonu w orientacji pionowej (ok. 375 px szerokości) - nagłówki i nawigację, kalkulator, listę „Moje oferty”, panele administratora oraz panel Analiza i Starszego handlowca; widok na komputerze i w poziomej orientacji telefonu pozostaje bez zmian. Zamieniono też termin płatności w kalkulatorze i panelu klientów z pary pól dat na przyciski gotowych wartości dni (0/</w:t>
+              <w:t>zamiast w osobnym dużym czerwonym bloku pod nazwą firmy. W Zestawieniu dodano widoczną plakietkę z kosztem transportu pozycji z listy i naprawiono zaniżanie stawki transportu €/t na już dodanych pozycjach, powodowane przez niedodany jeszcze szkic kolejnej pozycji w formularzu kalkulatora. Poprawiono też responsywność całej aplikacji na wąskich ekranach telefonu w orientacji pionowej (ok. 375 px szerokości) - nagłówki i nawigację, kalkulator, listę „Moje oferty”, panele administratora oraz panel Analiza i Starszego handlowca; widok na komputerze i w poziomej orientacji telefonu pozostaje bez zmian. Zamieniono też termin płatności w kalkulatorze i panelu klientów z pary pól dat na przyciski gotowych wartości dni (0/</w:t>
             </w:r>
             <w:r>
               <w:t>2/</w:t>
@@ -341,10 +379,11 @@
               <w:t xml:space="preserve"> </w:t>
             </w:r>
             <w:r>
-              <w:t xml:space="preserve">i naprawiono zawijanie się symbolu waluty w PDF przy bardzo dużych kwotach (powyżej 1 000 000 €). Okres ważności oferty dostał te same gotowe przyciski (Q1–Q4/„Ten miesiąc”/„Niestandardowy”) co termin płatności, z domyślnym okresem i 2-dniowym terminem dla nowej oferty bez klienta; przywrócono też do stopki PDF linijkę o 48-godzinnej ważności oferty, teraz liczoną z wybranego terminu płatności zamiast na sztywno. Naprawiono też analogiczne do walutowego ucinanie bardzo dużych wartości tonażu w PDF. Okres ważności oferty: przyciski Q1–Q4 pokazują teraz tylko kwartały wybranego roku, które jeszcze się nie zakończyły – dla roku bieżącego znikają więc już minione kwartały (np. we wrześniu widoczne są tylko Q3 i Q4), tak by handlowiec nie mógł wystawić nowej oferty z okresem ważności całkowicie w przeszłości; nowo odslonięte kwartały po zmianie na kolejny rok pojawiają się z krótką animacją zamiast skokowo. Panel „Analiza” zyskał zamykalne plakietki </w:t>
+              <w:t xml:space="preserve">i naprawiono zawijanie się symbolu waluty w PDF przy bardzo dużych kwotach (powyżej 1 000 000 €). Okres ważności oferty dostał te same gotowe przyciski (Q1–Q4/„Ten miesiąc”/„Niestandardowy”) co termin płatności, z domyślnym okresem i 2-dniowym terminem dla nowej oferty bez klienta; przywrócono też do stopki PDF linijkę o 48-godzinnej ważności oferty, teraz liczoną z wybranego terminu płatności zamiast na sztywno. Naprawiono też analogiczne do walutowego ucinanie bardzo dużych wartości tonażu w PDF. Okres ważności oferty: przyciski Q1–Q4 pokazują teraz tylko kwartały wybranego roku, które jeszcze się nie zakończyły – dla roku bieżącego znikają więc już minione kwartały (np. we wrześniu widoczne są tylko Q3 i Q4), tak by handlowiec nie mógł wystawić nowej oferty z okresem ważności całkowicie w przeszłości; nowo odslonięte kwartały po zmianie na kolejny rok pojawiają się z krótką </w:t>
             </w:r>
             <w:r>
-              <w:t>aktywnego zawężenia (handlowiec/typ stali/status/decyzja klienta/firma) widoczne zarówno w zbiorczym pasku na górze, jak i przy powiązanym panelu oraz eksporcie do Excela. Panel „Handlowcy” administratora dostał zakładki filtrowania po roli z licznikiem kont, a lista ofert administratora pokazuje zamykalną plakietkę handlowca, gdy jest już zawężona do konkretnej osoby. Dodano przycisk „2” w wyborze terminu płatności (kalkulator, panel „Klienci”), tak by domyślny 2-dniowy termin nowej oferty pokazywał się jako gotowy wybór zamiast wartości wpisanej w polu „Inny”. Panel „Handlowcy” w Analizie zyskał też przełącznik filtrujący ranking wyników wg roli (Wszystko/młodszy handlowiec/starszy handlowiec/administrator), z przeliczeniem udziałów procentowych i wiersza „Razem” dla zawężonej grupy. Dodano też w kalkulatorze krótką plakietkę informacyjną przy wyborze okresu ważności oferty na kwartał inny niż bieżący, gdy PGL zaplanowane na ten kwartał różni się od aktualnie obowiązującego, tak by handlowiec od razu widział, że wycena jedzie na innej cenie wsadu. Dodano też podstawową infrastrukturę PWA (manifest, ikony, service worker) z plakietką instalacji aplikacji widoczną wyłącznie na ekranie logowania na telefonach z Androidem, znikającą automatycznie po zalogowaniu. Nagłówek sekcji „Trasa i transport” w Zestawieniu wyróżniono pogrubieniem i kolorem akcentu, żeby było wyraźniej widać, że to klikalny przycisk rozwijający panel.</w:t>
+              <w:lastRenderedPageBreak/>
+              <w:t>animacją zamiast skokowo. Panel „Analiza” zyskał zamykalne plakietki aktywnego zawężenia (handlowiec/typ stali/status/decyzja klienta/firma) widoczne zarówno w zbiorczym pasku na górze, jak i przy powiązanym panelu oraz eksporcie do Excela. Panel „Handlowcy” administratora dostał zakładki filtrowania po roli z licznikiem kont, a lista ofert administratora pokazuje zamykalną plakietkę handlowca, gdy jest już zawężona do konkretnej osoby. Dodano przycisk „2” w wyborze terminu płatności (kalkulator, panel „Klienci”), tak by domyślny 2-dniowy termin nowej oferty pokazywał się jako gotowy wybór zamiast wartości wpisanej w polu „Inny”. Panel „Handlowcy” w Analizie zyskał też przełącznik filtrujący ranking wyników wg roli (Wszystko/młodszy handlowiec/starszy handlowiec/administrator), z przeliczeniem udziałów procentowych i wiersza „Razem” dla zawężonej grupy. Dodano też w kalkulatorze krótką plakietkę informacyjną przy wyborze okresu ważności oferty na kwartał inny niż bieżący, gdy PGL zaplanowane na ten kwartał różni się od aktualnie obowiązującego, tak by handlowiec od razu widział, że wycena jedzie na innej cenie wsadu. Dodano też podstawową infrastrukturę PWA (manifest, ikony, service worker) z plakietką instalacji aplikacji widoczną wyłącznie na ekranie logowania na telefonach z Androidem, znikającą automatycznie po zalogowaniu. Nagłówek sekcji „Trasa i transport” w Zestawieniu wyróżniono pogrubieniem i kolorem akcentu, żeby było wyraźniej widać, że to klikalny przycisk rozwijający panel.</w:t>
             </w:r>
           </w:p>
         </w:tc>
@@ -399,25 +438,25 @@
           </w:tcPr>
           <w:p>
             <w:r>
-              <w:t xml:space="preserve">Dodano opcjonalny komentarz do pozycji z niezerową dopłatą dodatkową w kalkulatorze. Pole komentarza oraz osobny checkbox „Dołącz komentarz do PDF” pojawiają się dopiero po wpisaniu wartości różnej od zera, a treść zapisuje się razem z resztą konfiguracji pozycji (odtwarzana przy edycji, nieusuwana przy chwilowym wyzerowaniu dopłaty). Po zaznaczeniu checkboxa komentarz trafia jako dodatkowy wpis do kolumny „Uwagi” w PDF oferty, we wszystkich miejscach eksportu (kalkulator, Moje oferty, Panel seniora, Panel administratora). </w:t>
+              <w:t xml:space="preserve">Dodano opcjonalny komentarz do pozycji z niezerową dopłatą dodatkową w kalkulatorze. Pole </w:t>
             </w:r>
             <w:r>
               <w:lastRenderedPageBreak/>
-              <w:t xml:space="preserve">Dodano również gatunek jednorazowy - możliwość wyceny gatunku spoza cennika (nazwa + dopłata EUR/t) w obrębie jednej oferty, bez dopisywania go do cennika i bez wpływu na pozostałe oferty. Dodano też opcję odbioru własnego w transporcie - checkbox w panelu „Trasa i transport” ustawia transport na 0 €/t, gdy klient sam odbiera towar spod zakładu. Dodano też harmonogram kwartalny PGL bazowego: administrator planuje ceny na Q1–Q4 wybranego roku osobno dla każdego typu stali, a kalkulator przełącza się na cenę danego kwartału automatycznie z chwilą jego rozpoczęcia. Tabela w panelu administratora pokazuje obok siebie cenę bieżącego miesiąca i wszystkie cztery kwartały. Funkcja wymaga migracji bazy danych (021_create_pgl_quarterly_prices.sql). Poprawiono też zapis ustawień, który przy aktywnej cenie kwartalnej nadpisywał nią ręczną cenę bazową PGL, oraz zaktualizowano dokumentację repozytorium (README, opis „About” na GitHubie, zrzuty ekranu kalkulatora) i numer wersji w nagłówku aplikacji do v1.8. Cały panel kalkulacji zyskał też zwijanie/rozwijanie jednym kliknięciem, analogicznie do panelu Danych Klienta. Ostrzeżenia o PGL poniżej bazy i marży poniżej minimum stały się też wyraźnie widoczne - zamiast drobnego żółtego tekstu pokazują się teraz jako czerwono obramowany, pogrubiony komunikat. Złom w podsumowaniu SSC przestał być stałą kwotą 10 €/t - jest teraz % ceny wsadu (domyślnie 2%), konfigurowalny przez administratora w Ustawieniach. Poprawiono też historię zmian cen bazowych PGL, która nie rejestrowała zmian wprowadzanych przez harmonogram </w:t>
+              <w:t xml:space="preserve">komentarza oraz osobny checkbox „Dołącz komentarz do PDF” pojawiają się dopiero po wpisaniu wartości różnej od zera, a treść zapisuje się razem z resztą konfiguracji pozycji (odtwarzana przy edycji, nieusuwana przy chwilowym wyzerowaniu dopłaty). Po zaznaczeniu checkboxa komentarz trafia jako dodatkowy wpis do kolumny „Uwagi” w PDF oferty, we wszystkich miejscach eksportu (kalkulator, Moje oferty, Panel seniora, Panel administratora). Dodano również gatunek jednorazowy - możliwość wyceny gatunku spoza cennika (nazwa + dopłata EUR/t) w obrębie jednej oferty, bez dopisywania go do cennika i bez wpływu na pozostałe oferty. Dodano też opcję odbioru własnego w transporcie - checkbox w panelu „Trasa i transport” ustawia transport na 0 €/t, gdy klient sam odbiera towar spod zakładu. Dodano też harmonogram kwartalny PGL bazowego: administrator planuje ceny na Q1–Q4 wybranego roku osobno dla każdego typu stali, a kalkulator przełącza się na cenę danego kwartału automatycznie z chwilą jego rozpoczęcia. Tabela w panelu administratora pokazuje obok siebie cenę bieżącego miesiąca i wszystkie cztery kwartały. Funkcja wymaga migracji bazy danych (021_create_pgl_quarterly_prices.sql). Poprawiono też zapis ustawień, który przy aktywnej cenie kwartalnej nadpisywał nią ręczną cenę bazową PGL, oraz zaktualizowano dokumentację repozytorium (README, opis „About” na GitHubie, zrzuty ekranu kalkulatora) i numer wersji w nagłówku aplikacji do v1.8. Cały panel kalkulacji zyskał też zwijanie/rozwijanie jednym kliknięciem, analogicznie do panelu Danych Klienta. Ostrzeżenia o PGL </w:t>
             </w:r>
             <w:r>
               <w:lastRenderedPageBreak/>
-              <w:t xml:space="preserve">kwartalny (edycję ceny bieżącego kwartału) - teraz trafiają do tego samego logu co ręczne zmiany. Dodano też okres ważności oferty: pola „Ważna od”/„Ważna do” obok przełącznika Arkusz/Krąg. Kwartał wyznaczony z daty „Ważna od” automatycznie dobiera PGL bazowe zaplanowane w harmonogramie kwartalnym dla tego okresu, tą samą logiką co dotychczasowe przełączanie na bieżący kwartał - tylko sparametryzowaną wybranym okresem zamiast „teraz”. Gdy zakres „od”–„do” wykracza poza jeden kwartał, PGL nie jest dobierane automatycznie i pojawia się czerwone ostrzeżenie. Wybrany zakres dat trafia też dodatkowo do stopki PDF oferty, obok dotychczasowej formułki o 48-godzinnej ważności oferty. Kwota złomu w podsumowaniu SSC jest teraz zaokrąglana do liczby całkowitej, na polecenie </w:t>
+              <w:t xml:space="preserve">poniżej bazy i marży poniżej minimum stały się też wyraźnie widoczne - zamiast drobnego żółtego tekstu pokazują się teraz jako czerwono obramowany, pogrubiony komunikat. Złom w podsumowaniu SSC przestał być stałą kwotą 10 €/t - jest teraz % ceny wsadu (domyślnie 2%), konfigurowalny przez administratora w Ustawieniach. Poprawiono też historię zmian cen bazowych PGL, która nie rejestrowała zmian wprowadzanych przez harmonogram kwartalny (edycję ceny bieżącego kwartału) - teraz trafiają do tego samego logu co ręczne zmiany. Dodano też okres ważności oferty: pola „Ważna od”/„Ważna do” obok przełącznika Arkusz/Krąg. Kwartał wyznaczony z daty „Ważna od” automatycznie dobiera PGL bazowe zaplanowane w harmonogramie kwartalnym dla tego okresu, tą samą logiką co dotychczasowe przełączanie na bieżący kwartał - tylko sparametryzowaną wybranym okresem zamiast „teraz”. Gdy zakres „od”–„do” wykracza poza jeden kwartał, PGL nie jest dobierane automatycznie i pojawia się czerwone ostrzeżenie. Wybrany zakres dat trafia też dodatkowo do stopki PDF oferty, obok dotychczasowej formułki o 48-godzinnej ważności oferty. Kwota złomu w podsumowaniu SSC jest teraz zaokrąglana do liczby całkowitej, na polecenie </w:t>
             </w:r>
             <w:r>
               <w:t>Łukasza</w:t>
             </w:r>
             <w:r>
-              <w:t xml:space="preserve">. Dodano też termin płatności: osobna para pól „od”/„do” obok okresu ważności oferty, gdzie „do” domyślnie dolicza się jako „od” + termin klienta (konfigurowalny w panelu Klienci, dostępnym też dla starszego handlowca) albo globalny domyślny z Ustawień (domyślnie 7 dni), z możliwością ręcznej zmiany; ustawiony termin trafia też do stopki PDF, zastępując ogólną formułkę o warunkach płatności. Poprawiono też PDF oferty: podsumowanie sumy przestało powtarzać się po każdej stronie tabeli pozycji (pokazuje się teraz raz, po ostatniej pozycji), a tekst w kolumnach „Cena”/„Wartość” przestał się rozjeżdżać przy pięciocyfrowych kwotach. W zestawieniu pozycji doszła możliwość zmiany kolejności wierszy przeciąganiem za uchwyt, z automatycznym przeliczeniem numeracji „Lp.” i płynną animacją przesuwania pozostałych pozycji - </w:t>
+              <w:t xml:space="preserve">. Dodano też termin płatności: osobna para pól „od”/„do” obok okresu ważności oferty, gdzie „do” domyślnie dolicza się jako „od” + termin klienta (konfigurowalny w panelu Klienci, dostępnym też dla starszego handlowca) albo globalny domyślny z Ustawień (domyślnie 7 dni), z możliwością ręcznej zmiany; ustawiony termin trafia też do stopki PDF, zastępując ogólną formułkę o warunkach płatności. Poprawiono też </w:t>
             </w:r>
             <w:r>
               <w:lastRenderedPageBreak/>
-              <w:t>nowa kolejność obowiązuje też w PDF, Excelu i zapisanej ofercie; funkcja działa również dotykiem na telefonie i tablecie, nie tylko myszką. Podsumowanie zestawienia pozycji pokazuje teraz również łączną liczbę ton, wyrównaną w wierszu podsumowującym dokładnie pod kolumnami „Tony” i „Wartość” tabeli. Dodano też migrację przeterminowanego PGL: otwarcie do edycji zapisanej oferty (albo świeżo zduplikowanej kopii) wycenionej w innym kwartale niż bieżący automatycznie aktualizuje PGL bazowe, PGL/marżę/cenę każdej pozycji zestawienia oraz okres ważności do dzisiejszej daty, z wyraźnym banerem informującym o zmianie i liczbie przeliczonych pozycji; nic nie zapisuje się do bazy bez ręcznego zapisania oferty.</w:t>
+              <w:t>PDF oferty: podsumowanie sumy przestało powtarzać się po każdej stronie tabeli pozycji (pokazuje się teraz raz, po ostatniej pozycji), a tekst w kolumnach „Cena”/„Wartość” przestał się rozjeżdżać przy pięciocyfrowych kwotach. W zestawieniu pozycji doszła możliwość zmiany kolejności wierszy przeciąganiem za uchwyt, z automatycznym przeliczeniem numeracji „Lp.” i płynną animacją przesuwania pozostałych pozycji - nowa kolejność obowiązuje też w PDF, Excelu i zapisanej ofercie; funkcja działa również dotykiem na telefonie i tablecie, nie tylko myszką. Podsumowanie zestawienia pozycji pokazuje teraz również łączną liczbę ton, wyrównaną w wierszu podsumowującym dokładnie pod kolumnami „Tony” i „Wartość” tabeli. Dodano też migrację przeterminowanego PGL: otwarcie do edycji zapisanej oferty (albo świeżo zduplikowanej kopii) wycenionej w innym kwartale niż bieżący automatycznie aktualizuje PGL bazowe, PGL/marżę/cenę każdej pozycji zestawienia oraz okres ważności do dzisiejszej daty, z wyraźnym banerem informującym o zmianie i liczbie przeliczonych pozycji; nic nie zapisuje się do bazy bez ręcznego zapisania oferty.</w:t>
             </w:r>
           </w:p>
         </w:tc>
@@ -460,11 +499,11 @@
           </w:tcPr>
           <w:p>
             <w:r>
-              <w:t xml:space="preserve">Naprawiono błąd zapisu decyzji klienta (wygrana / przegrana) na ofercie wysłanej - konflikt typów parametru w zapytaniu SQL (kod 42P08); wcześniej funkcja nie zapisywała żadnej decyzji. Zablokowano wysyłkę oferty do klienta bez danych firmy klienta (nazwa firmy i NIP) - tworzenie i zapis oferty bez tych danych nadal działają. Senior może zbudować zespół z juniorów (sekcja „Mój zespół” w panelu seniora i administratora), a panel „Analiza” pokazuje mu wtedy dane własne oraz całego zespołu, z możliwością zawężenia do siebie lub wybranego juniora. Eksport ofert, panelu „Analiza” i historii PGL do Excela otwiera się teraz z kolumnami dopasowanymi do zawartości, bez ręcznego rozciągania. Dodano automatyczne liczenie transportu z trasy dostawy: rzeczywista odległość drogowa do klienta, cennik przewoźnika w pasmach kilometrowych, przeliczanie na kursy </w:t>
+              <w:t xml:space="preserve">Naprawiono błąd zapisu decyzji klienta (wygrana / przegrana) na ofercie wysłanej - konflikt typów parametru w zapytaniu SQL (kod 42P08); wcześniej funkcja nie zapisywała żadnej decyzji. Zablokowano wysyłkę oferty do klienta bez danych firmy klienta (nazwa firmy i NIP) - tworzenie i zapis oferty bez tych danych nadal działają. Senior może zbudować zespół z juniorów (sekcja „Mój zespół” w panelu seniora i administratora), a </w:t>
             </w:r>
             <w:r>
               <w:lastRenderedPageBreak/>
-              <w:t>według ładowności 21 t i dopłaty za elementy ponadwymiarowe, wraz z edytowalnym cennikiem w panelu administratora. Wysoki kontrast (jasny i ciemny) przeszedł na nowoczesną paletę kolorów wspólną ze zwykłym motywem – zamiast czerni-na-bieli tryb ten daje teraz większą czcionkę, powiększony widok i grubsze obramowania przy firmowych kolorach. Naprawiono też fałszywe ostrzeżenie o niezapisanych zmianach po rozpoczęciu nowej oferty w trakcie edycji zapisanej – pojawiało się mimo pustego, niezmienionego formularza. Blacha łezkowa otrzymała dopłatę wymiarową zależną od szerokości (30 €/t do 1,5 m, 45 €/t powyżej) oraz własną tabelę gatunków z domyślnym S235JR+N. Wersja 1.7 została wdrożona na środowisko produkcyjne 10.09.2026 wraz z migracjami 019 (zespoły seniora, tabela „team_members”) i 020 (cennik transportowy, tabele „transport_tariff_bands” i „route_cache”); wdrożenie zakończone powodzeniem.</w:t>
+              <w:t>panel „Analiza” pokazuje mu wtedy dane własne oraz całego zespołu, z możliwością zawężenia do siebie lub wybranego juniora. Eksport ofert, panelu „Analiza” i historii PGL do Excela otwiera się teraz z kolumnami dopasowanymi do zawartości, bez ręcznego rozciągania. Dodano automatyczne liczenie transportu z trasy dostawy: rzeczywista odległość drogowa do klienta, cennik przewoźnika w pasmach kilometrowych, przeliczanie na kursy według ładowności 21 t i dopłaty za elementy ponadwymiarowe, wraz z edytowalnym cennikiem w panelu administratora. Wysoki kontrast (jasny i ciemny) przeszedł na nowoczesną paletę kolorów wspólną ze zwykłym motywem – zamiast czerni-na-bieli tryb ten daje teraz większą czcionkę, powiększony widok i grubsze obramowania przy firmowych kolorach. Naprawiono też fałszywe ostrzeżenie o niezapisanych zmianach po rozpoczęciu nowej oferty w trakcie edycji zapisanej – pojawiało się mimo pustego, niezmienionego formularza. Blacha łezkowa otrzymała dopłatę wymiarową zależną od szerokości (30 €/t do 1,5 m, 45 €/t powyżej) oraz własną tabelę gatunków z domyślnym S235JR+N. Wersja 1.7 została wdrożona na środowisko produkcyjne 10.09.2026 wraz z migracjami 019 (zespoły seniora, tabela „team_members”) i 020 (cennik transportowy, tabele „transport_tariff_bands” i „route_cache”); wdrożenie zakończone powodzeniem.</w:t>
             </w:r>
           </w:p>
         </w:tc>
@@ -507,15 +546,15 @@
           </w:tcPr>
           <w:p>
             <w:r>
-              <w:t xml:space="preserve">Uzupełniono tabelę gatunków PICKLED (HRS Trawiona) o brakujący zakres SAPH 440 -&gt; DD12 wraz z dodatkowymi gatunkami (K367-DD14+B, FE 600 DP, S300EK, P265GH, P275SL, P355NL2, SA516G60-LOWSI, S240 D), na podstawie danych przekazanych przez klienta. Poprawiono czytelność etykiet wersjonowania na liście ofert (numer oferty offer_id/offer_id.N zamieniony miejscami z nazwą oferty jako główny nagłówek wiersza, wyraźniejsza etykieta „poprzednia wersja”). Przycisk „Aktualizuj pozycję” w kalkulatorze zmienia teraz kolor na niebieski podczas edycji istniejącej pozycji, aby odróżnić go od żółtego przycisku dodawania nowej pozycji. Kliknięcie pozycji na liście zestawienia </w:t>
+              <w:t xml:space="preserve">Uzupełniono tabelę gatunków PICKLED (HRS Trawiona) o brakujący zakres SAPH 440 -&gt; DD12 wraz z dodatkowymi gatunkami (K367-DD14+B, FE 600 DP, S300EK, P265GH, P275SL, P355NL2, SA516G60-LOWSI, S240 D), na podstawie danych </w:t>
             </w:r>
             <w:r>
               <w:lastRenderedPageBreak/>
-              <w:t xml:space="preserve">(wiersz lub ołówek) przewija teraz widok automatycznie do góry kalkulatora. Cena bazowa PGL jest od teraz zawsze w EUR (€/t), niezależnie od waluty oferty. Podczas edycji zapisanej oferty w kalkulatorze pojawia się teraz wyraźny baner „Teraz edytujesz ofertę: offer_id”, tak by nie pomylić jej z tworzeniem nowej wyceny; baner pokazuje właściwy numer wersji (np. offer_27.1), nie surowe wewnętrzne ID wiersza w bazie. Tryb wysokiego kontrastu doczekał się osobnych wariantów jasnego i ciemnego (wcześniej był to jeden, stały motyw ignorujący przełącznik jasny/ciemny) - przełączanie między jasnym a ciemnym motywem działa teraz poprawnie również przy włączonym wysokim kontraście, a wyłączenie wysokiego kontrastu przywraca wcześniej wybrany motyw jasny lub ciemny. Poprawiono też kilka miejsc w interfejsie (pasek „Suma Huta”, przyciski przełączające, podpowiedzi gatunków, komunikaty ostrzegawcze), w których kolory tła i tekstu były zapisane na sztywno pod jasny wysoki kontrast i stawały się nieczytelne w wariancie ciemnym. Panel administratora zyskał filtrowanie i sortowanie historii zmian cen bazowych PGL (po typie stali, zakresie dat i dowolnej kolumnie tabeli) wraz z przyciskiem czyszczącym filtry; eksport do Excela odzwierciedla teraz aktualnie wybrany widok, a nie zawsze całą historię. Generowanie oferty PDF respektuje teraz język interfejsu wybrany przez handlowca (PL/EN/CS/DE) - wcześniej cały szablon PDF (nagłówki tabeli, etykiety danych klienta, uwagi prawne w stopce, podpisy) był na sztywno po polsku, niezależnie od języka ustawionego w aplikacji. Na liście „Moje oferty” naprawiono kliknięcie w rozwiniętej </w:t>
+              <w:t xml:space="preserve">przekazanych przez klienta. Poprawiono czytelność etykiet wersjonowania na liście ofert (numer oferty offer_id/offer_id.N zamieniony miejscami z nazwą oferty jako główny nagłówek wiersza, wyraźniejsza etykieta „poprzednia wersja”). Przycisk „Aktualizuj pozycję” w kalkulatorze zmienia teraz kolor na niebieski podczas edycji istniejącej pozycji, aby odróżnić go od żółtego przycisku dodawania nowej pozycji. Kliknięcie pozycji na liście zestawienia (wiersz lub ołówek) przewija teraz widok automatycznie do góry kalkulatora. Cena bazowa PGL jest od teraz zawsze w EUR (€/t), niezależnie od waluty oferty. Podczas edycji zapisanej oferty w kalkulatorze pojawia się teraz wyraźny baner „Teraz edytujesz ofertę: offer_id”, tak by nie pomylić jej z tworzeniem nowej wyceny; baner pokazuje właściwy numer wersji (np. offer_27.1), nie surowe wewnętrzne ID wiersza w bazie. Tryb wysokiego kontrastu doczekał się osobnych wariantów jasnego i ciemnego (wcześniej był to jeden, stały motyw ignorujący przełącznik jasny/ciemny) - przełączanie między jasnym a ciemnym motywem działa teraz poprawnie również przy włączonym wysokim kontraście, a wyłączenie wysokiego kontrastu przywraca wcześniej wybrany motyw jasny lub ciemny. Poprawiono też kilka miejsc w interfejsie (pasek „Suma Huta”, przyciski przełączające, podpowiedzi gatunków, komunikaty ostrzegawcze), w których kolory tła i tekstu były zapisane na sztywno pod jasny wysoki kontrast i stawały się nieczytelne w wariancie ciemnym. Panel administratora zyskał filtrowanie i sortowanie historii zmian cen bazowych PGL (po typie stali, zakresie dat i dowolnej kolumnie tabeli) wraz z </w:t>
             </w:r>
             <w:r>
               <w:lastRenderedPageBreak/>
-              <w:t>historii wersji ofert, które błędnie otwierało do edycji zawsze najnowszą wersję zamiast tej faktycznie klikniętej. W tej samej wersji dodano panel „Analiza” dla wszystkich ról (tonaż zaoferowany, wygrany i przegrany, wskaźnik skuteczności, rozbicie w czasie oraz według typu stali i klienta, tabela ofert z eksportem; zakres danych ustalany po stronie serwera - junior i senior widzą własne oferty, administrator całą firmę) wraz z nową osią „decyzja klienta” na ofercie wysłanej („wygrana” / „przegrana” / „oczekująca”, migracja 018), niezależną od statusu obiegu oferty.</w:t>
+              <w:t>przyciskiem czyszczącym filtry; eksport do Excela odzwierciedla teraz aktualnie wybrany widok, a nie zawsze całą historię. Generowanie oferty PDF respektuje teraz język interfejsu wybrany przez handlowca (PL/EN/CS/DE) - wcześniej cały szablon PDF (nagłówki tabeli, etykiety danych klienta, uwagi prawne w stopce, podpisy) był na sztywno po polsku, niezależnie od języka ustawionego w aplikacji. Na liście „Moje oferty” naprawiono kliknięcie w rozwiniętej historii wersji ofert, które błędnie otwierało do edycji zawsze najnowszą wersję zamiast tej faktycznie klikniętej. W tej samej wersji dodano panel „Analiza” dla wszystkich ról (tonaż zaoferowany, wygrany i przegrany, wskaźnik skuteczności, rozbicie w czasie oraz według typu stali i klienta, tabela ofert z eksportem; zakres danych ustalany po stronie serwera - junior i senior widzą własne oferty, administrator całą firmę) wraz z nową osią „decyzja klienta” na ofercie wysłanej („wygrana” / „przegrana” / „oczekująca”, migracja 018), niezależną od statusu obiegu oferty.</w:t>
             </w:r>
           </w:p>
         </w:tc>
@@ -558,11 +597,11 @@
           </w:tcPr>
           <w:p>
             <w:r>
-              <w:t xml:space="preserve">Naprawiono brak synchronizacji kontaktu głównego wpisywanego w panelu „Klienci” z tabelą osób kontaktowych - dane osoby zapisane przy edycji firmy nie pojawiały się w zakładce „Kontakty”. Panel „Klienci” zyskał akcję „Kontakty” przy każdej firmie: rozwija listę zapisanych dla niej osób z możliwością edycji i usunięcia każdej z osobna oraz formularzem dodania kolejnej, bez przechodzenia do osobnej zakładki. Dodano migrację uzupełniającą kontakty zapisane, zanim ta poprawka weszła w życie. Dodano tryb „Wysoki kontrast” (przycisk obok Jasny/Ciemny, dostępny na wszystkich podstronach). W tym samym okresie dodano historię zmian cen bazowych PGL z eksportem do Excela, kolorowe oznaczenia typów stali HRS/CR/HDG w panelu ustawień oraz klikalne kafelki statusów na pulpicie administratora, a w kalkulatorze kliknięcie wiersza pozycji otwiera ją do edycji. Kolumna „Uwagi” w PDF oferty pokazuje teraz pełny zestaw wybranych dopłat dla każdej pozycji. Panel ustawień administratora zyskał próg „Minimalna marża (%)” - junior może odtąd wysłać ofertę do klienta bezpośrednio z szkicu, bez </w:t>
+              <w:t xml:space="preserve">Naprawiono brak synchronizacji kontaktu głównego wpisywanego w panelu „Klienci” z tabelą osób kontaktowych - dane osoby zapisane przy edycji firmy nie pojawiały się w zakładce „Kontakty”. Panel „Klienci” zyskał akcję „Kontakty” przy każdej firmie: rozwija listę zapisanych dla niej osób z możliwością edycji i usunięcia każdej z osobna oraz formularzem dodania kolejnej, bez przechodzenia do osobnej zakładki. Dodano migrację uzupełniającą kontakty zapisane, zanim ta poprawka weszła w życie. Dodano tryb „Wysoki kontrast” (przycisk obok Jasny/Ciemny, dostępny na wszystkich podstronach). W tym samym okresie dodano historię </w:t>
             </w:r>
             <w:r>
               <w:lastRenderedPageBreak/>
-              <w:t>zatwierdzenia seniora/administratora, jeśli każda pozycja ma marżę i PGL bazowe w normie; w przeciwnym razie oferta nadal wymaga pełnej ścieżki zatwierdzenia. Kliknięcie w ofertę na liście (Moje oferty, Panel seniora, Panel administratora) otwiera ją teraz do edycji, tak jak pozycje w kalkulatorze. Edycja już zapisanej oferty nie nadpisuje jej w miejscu - zapisuje nową wersję („offer_30.1”, „offer_30.2”...), a poprzednie wersje zostają widoczne pod rozwijaną listą na tej samej karcie. W tym samym okresie dodano trzy nowe typy stali obok HRS/CR/HDG: PICKLED (HRS Trawiona), TEARDROP (Blacha łezkowa) i ZM (Magnelis) - wraz z własnymi tabelami gatunków, matrycami dopłat wymiarowych i (dla ZM) matrycą powłoki, w oparciu o dane przekazane przez klienta.</w:t>
+              <w:t>zmian cen bazowych PGL z eksportem do Excela, kolorowe oznaczenia typów stali HRS/CR/HDG w panelu ustawień oraz klikalne kafelki statusów na pulpicie administratora, a w kalkulatorze kliknięcie wiersza pozycji otwiera ją do edycji. Kolumna „Uwagi” w PDF oferty pokazuje teraz pełny zestaw wybranych dopłat dla każdej pozycji. Panel ustawień administratora zyskał próg „Minimalna marża (%)” - junior może odtąd wysłać ofertę do klienta bezpośrednio z szkicu, bez zatwierdzenia seniora/administratora, jeśli każda pozycja ma marżę i PGL bazowe w normie; w przeciwnym razie oferta nadal wymaga pełnej ścieżki zatwierdzenia. Kliknięcie w ofertę na liście (Moje oferty, Panel seniora, Panel administratora) otwiera ją teraz do edycji, tak jak pozycje w kalkulatorze. Edycja już zapisanej oferty nie nadpisuje jej w miejscu - zapisuje nową wersję („offer_30.1”, „offer_30.2”...), a poprzednie wersje zostają widoczne pod rozwijaną listą na tej samej karcie. W tym samym okresie dodano trzy nowe typy stali obok HRS/CR/HDG: PICKLED (HRS Trawiona), TEARDROP (Blacha łezkowa) i ZM (Magnelis) - wraz z własnymi tabelami gatunków, matrycami dopłat wymiarowych i (dla ZM) matrycą powłoki, w oparciu o dane przekazane przez klienta.</w:t>
             </w:r>
           </w:p>
         </w:tc>
@@ -605,11 +644,11 @@
           </w:tcPr>
           <w:p>
             <w:r>
-              <w:t xml:space="preserve">Poprawki bezpieczeństwa eksportu PDF: dane oferty i klienta wpisywane przez handlowca są zabezpieczane przed wykonaniem jako kod po stronie usługi generującej dokument, a samo generowanie PDF wymaga jawnie potwierdzonej roli użytkownika. W kalkulatorze dodano ostrzeżenie przy edycji pozycji dodanych przed wersją 1.3, dla których konfiguracja dopłat nie została zapisana i nie da się jej automatycznie odtworzyć. Przebudowano panel danych klienta w kalkulatorze: dane firmy (firma, NIP, adres, SAP ID) zostały oddzielone od danych kontaktowych, a pola „Firma” i „NIP” działają jak wyszukiwarki po katalogu klientów. Osoby kontaktowe są od teraz wspólne dla całego działu - jedna firma może mieć ich wiele, a pole imienia podpowiada je od razu po kliknięciu. Naprawiono także brak natychmiastowej widoczności zmian ustawień administratora (PGL bazowe, kurs EUR/PLN) w kalkulatorze bez </w:t>
+              <w:t xml:space="preserve">Poprawki bezpieczeństwa eksportu PDF: dane oferty i klienta wpisywane przez handlowca są zabezpieczane przed wykonaniem jako kod po stronie usługi generującej dokument, a samo generowanie PDF wymaga jawnie potwierdzonej roli użytkownika. W kalkulatorze dodano ostrzeżenie przy edycji pozycji dodanych przed wersją 1.3, dla których konfiguracja dopłat nie została zapisana i nie da się jej automatycznie odtworzyć. Przebudowano panel </w:t>
             </w:r>
             <w:r>
               <w:lastRenderedPageBreak/>
-              <w:t>przeładowania strony, a PGL bazowe skonfigurowano osobno dla typów stali HRS, CR i HDG. Cena końcowa oraz sumy wartości w kalkulatorze, na liście ofert i w PDF są od teraz zaokrąglane w górę do pełnej jednostki waluty - świadoma decyzja biznesowa, żeby nigdy nie zaniżyć ceny wobec klienta.</w:t>
+              <w:t>danych klienta w kalkulatorze: dane firmy (firma, NIP, adres, SAP ID) zostały oddzielone od danych kontaktowych, a pola „Firma” i „NIP” działają jak wyszukiwarki po katalogu klientów. Osoby kontaktowe są od teraz wspólne dla całego działu - jedna firma może mieć ich wiele, a pole imienia podpowiada je od razu po kliknięciu. Naprawiono także brak natychmiastowej widoczności zmian ustawień administratora (PGL bazowe, kurs EUR/PLN) w kalkulatorze bez przeładowania strony, a PGL bazowe skonfigurowano osobno dla typów stali HRS, CR i HDG. Cena końcowa oraz sumy wartości w kalkulatorze, na liście ofert i w PDF są od teraz zaokrąglane w górę do pełnej jednostki waluty - świadoma decyzja biznesowa, żeby nigdy nie zaniżyć ceny wobec klienta.</w:t>
             </w:r>
           </w:p>
         </w:tc>
@@ -705,7 +744,11 @@
           </w:tcPr>
           <w:p>
             <w:r>
-              <w:t>Poprawki regresji po integracji podczas Deployu (m.in. krytyczny błąd edycji pozycji, przywrócona waga arkusza), ujednolicenie generowania PDF na wersję serwerową, zamknięcie rejestracji kont dla administratora oraz eksport ofert do Excela w formacie KTS/GPAO.</w:t>
+              <w:t xml:space="preserve">Poprawki regresji po integracji podczas Deployu (m.in. krytyczny błąd edycji pozycji, przywrócona waga arkusza), ujednolicenie generowania PDF na wersję serwerową, zamknięcie </w:t>
+            </w:r>
+            <w:r>
+              <w:lastRenderedPageBreak/>
+              <w:t>rejestracji kont dla administratora oraz eksport ofert do Excela w formacie KTS/GPAO.</w:t>
             </w:r>
           </w:p>
         </w:tc>
@@ -721,6 +764,7 @@
                 <w:b/>
                 <w:color w:val="1F2A44"/>
               </w:rPr>
+              <w:lastRenderedPageBreak/>
               <w:t>1.1</w:t>
             </w:r>
           </w:p>
@@ -905,17 +949,13 @@
           <w:tcPr>
             <w:tcW w:w="1948" w:type="dxa"/>
           </w:tcPr>
-          <w:p>
-            <w:r/>
-          </w:p>
+          <w:p/>
         </w:tc>
         <w:tc>
           <w:tcPr>
             <w:tcW w:w="6908" w:type="dxa"/>
           </w:tcPr>
-          <w:p>
-            <w:r/>
-          </w:p>
+          <w:p/>
         </w:tc>
       </w:tr>
     </w:tbl>
@@ -952,8 +992,8 @@
         <w:tblLook w:val="04A0" w:firstRow="1" w:lastRow="0" w:firstColumn="1" w:lastColumn="0" w:noHBand="0" w:noVBand="1"/>
       </w:tblPr>
       <w:tblGrid>
-        <w:gridCol w:w="1964"/>
-        <w:gridCol w:w="6892"/>
+        <w:gridCol w:w="1963"/>
+        <w:gridCol w:w="6893"/>
       </w:tblGrid>
       <w:tr>
         <w:tc>
@@ -992,17 +1032,13 @@
           <w:tcPr>
             <w:tcW w:w="1948" w:type="dxa"/>
           </w:tcPr>
-          <w:p>
-            <w:r/>
-          </w:p>
+          <w:p/>
         </w:tc>
         <w:tc>
           <w:tcPr>
             <w:tcW w:w="6908" w:type="dxa"/>
           </w:tcPr>
-          <w:p>
-            <w:r/>
-          </w:p>
+          <w:p/>
         </w:tc>
       </w:tr>
     </w:tbl>
@@ -1039,8 +1075,8 @@
         <w:tblLook w:val="04A0" w:firstRow="1" w:lastRow="0" w:firstColumn="1" w:lastColumn="0" w:noHBand="0" w:noVBand="1"/>
       </w:tblPr>
       <w:tblGrid>
-        <w:gridCol w:w="1945"/>
-        <w:gridCol w:w="6911"/>
+        <w:gridCol w:w="1944"/>
+        <w:gridCol w:w="6912"/>
       </w:tblGrid>
       <w:tr>
         <w:tc>
@@ -1080,7 +1116,9 @@
             <w:tcW w:w="1948" w:type="dxa"/>
           </w:tcPr>
           <w:p>
-            <w:r/>
+            <w:r>
+              <w:t>Poprawka</w:t>
+            </w:r>
           </w:p>
         </w:tc>
         <w:tc>
@@ -1088,7 +1126,9 @@
             <w:tcW w:w="6908" w:type="dxa"/>
           </w:tcPr>
           <w:p>
-            <w:r/>
+            <w:r>
+              <w:t>Naprawiono brak możliwości podejrzenia cen i specyfikacji oferty oczekującej na walidację w panelu Starszego handlowca (zgłoszenie testerów). Liczba pozycji oraz link „+N więcej” pod ofertą są teraz klikalne i rozwijają tabelę pozycji: gatunek i wymiary, typ, cena jednostkowa, tony i wartość pozycji, w walucie oferty. Widok i działanie takie same jak na liście „Moje oferty”. Zmiana wyłącznie prezentacyjna - bez wpływu na wyliczenia cen.</w:t>
+            </w:r>
           </w:p>
         </w:tc>
       </w:tr>
@@ -1126,8 +1166,8 @@
         <w:tblLook w:val="04A0" w:firstRow="1" w:lastRow="0" w:firstColumn="1" w:lastColumn="0" w:noHBand="0" w:noVBand="1"/>
       </w:tblPr>
       <w:tblGrid>
-        <w:gridCol w:w="1953"/>
-        <w:gridCol w:w="6903"/>
+        <w:gridCol w:w="1944"/>
+        <w:gridCol w:w="6912"/>
       </w:tblGrid>
       <w:tr>
         <w:tc>
@@ -1166,17 +1206,13 @@
           <w:tcPr>
             <w:tcW w:w="1948" w:type="dxa"/>
           </w:tcPr>
-          <w:p>
-            <w:r/>
-          </w:p>
+          <w:p/>
         </w:tc>
         <w:tc>
           <w:tcPr>
             <w:tcW w:w="6908" w:type="dxa"/>
           </w:tcPr>
-          <w:p>
-            <w:r/>
-          </w:p>
+          <w:p/>
         </w:tc>
       </w:tr>
     </w:tbl>
@@ -1253,17 +1289,13 @@
           <w:tcPr>
             <w:tcW w:w="1963" w:type="dxa"/>
           </w:tcPr>
-          <w:p>
-            <w:r/>
-          </w:p>
+          <w:p/>
         </w:tc>
         <w:tc>
           <w:tcPr>
             <w:tcW w:w="6893" w:type="dxa"/>
           </w:tcPr>
-          <w:p>
-            <w:r/>
-          </w:p>
+          <w:p/>
         </w:tc>
       </w:tr>
     </w:tbl>
@@ -1285,6 +1317,7 @@
         <w:pStyle w:val="Listapunktowana"/>
       </w:pPr>
       <w:r>
+        <w:lastRenderedPageBreak/>
         <w:t>Import ofert z pliku Excel (format KTS/GPAO) - przeanalizowany, budowa świadomie odłożona na później</w:t>
       </w:r>
     </w:p>

</xml_diff>

<commit_message>
feat: approve/reject from calculator, below-guidelines notice, client rejection reason
- Senior/admin can approve or reject a pending offer from the calculator (blocked while unsaved)
- Notice lists positions below margin / PGL guidelines (senior panel + calculator)
- Client rejection: reason dropdown + custom text, default "other"; migration 024 (run before deploy)
- v2.0 report updated

Co-Authored-By: Claude Sonnet 5.5 <noreply@anthropic.com>
</commit_message>
<xml_diff>
--- a/Historia wersji oraz md/Historia wersji/AMSteel_Quote_Raport_Wersji_2.0.docx
+++ b/Historia wersji oraz md/Historia wersji/AMSteel_Quote_Raport_Wersji_2.0.docx
@@ -318,7 +318,7 @@
           </w:tcPr>
           <w:p>
             <w:r>
-              <w:t>Panel Starszego handlowca: liczba pozycji przy ofercie oczekującej na walidację jest teraz klikalna i rozwija pełną tabelę pozycji (gatunek, wymiary, typ, cena, tony, wartość) - tak jak na liście „Moje oferty”.</w:t>
+              <w:t>Panel Starszego handlowca: rozwijana tabela pozycji z cenami oraz lista pozycji poniżej wytycznych (marża / PGL). Walidacja (zatwierdź / odrzuć) także z poziomu kalkulatora. Powód odrzucenia oferty przez klienta jako lista rozwijana (z opcją „Inne” i własnym tekstem).</w:t>
             </w:r>
           </w:p>
         </w:tc>
@@ -1132,6 +1132,72 @@
           </w:p>
         </w:tc>
       </w:tr>
+      <w:tr>
+        <w:tc>
+          <w:tcPr>
+            <w:tcW w:w="1948" w:type="dxa"/>
+          </w:tcPr>
+          <w:p>
+            <w:r>
+              <w:t>Nowa funkcja</w:t>
+            </w:r>
+          </w:p>
+        </w:tc>
+        <w:tc>
+          <w:tcPr>
+            <w:tcW w:w="6908" w:type="dxa"/>
+          </w:tcPr>
+          <w:p>
+            <w:r>
+              <w:t>Walidacja oferty bezpośrednio z kalkulatora: po wejściu w ofertę oczekującą na weryfikację (przycisk „Edytuj w kalkulatorze”) Starszy handlowiec / Administrator ma na górze przyciski „Zatwierdź” i „Odrzuć” (odrzucenie wymaga powodu). Przy niezapisanych zmianach przyciski są zablokowane z podpowiedzią - decyzja dotyczy zapisanej wersji oferty. Po decyzji następuje powrót do panelu Starszego handlowca.</w:t>
+            </w:r>
+          </w:p>
+        </w:tc>
+      </w:tr>
+      <w:tr>
+        <w:tc>
+          <w:tcPr>
+            <w:tcW w:w="1948" w:type="dxa"/>
+          </w:tcPr>
+          <w:p>
+            <w:r>
+              <w:t>Nowa funkcja</w:t>
+            </w:r>
+          </w:p>
+        </w:tc>
+        <w:tc>
+          <w:tcPr>
+            <w:tcW w:w="6908" w:type="dxa"/>
+          </w:tcPr>
+          <w:p>
+            <w:r>
+              <w:t>Informacja o cenie poniżej wytycznych przed walidacją: w panelu Starszego handlowca (oferta oczekująca na weryfikację) oraz w kalkulatorze pod paskiem walidacji pojawia się lista pozycji, które nie spełniają wytycznych, z konkretną wartością i progiem - np. „marża 4% &lt; min 6%” albo „PGL 640 &lt; baza 645”. Reguła jest ta sama, która decyduje o konieczności zatwierdzenia oferty (jedno źródło w kodzie), więc komunikat nie może się rozjechać z wymogiem.</w:t>
+            </w:r>
+          </w:p>
+        </w:tc>
+      </w:tr>
+      <w:tr>
+        <w:tc>
+          <w:tcPr>
+            <w:tcW w:w="1948" w:type="dxa"/>
+          </w:tcPr>
+          <w:p>
+            <w:r>
+              <w:t>Nowa funkcja</w:t>
+            </w:r>
+          </w:p>
+        </w:tc>
+        <w:tc>
+          <w:tcPr>
+            <w:tcW w:w="6908" w:type="dxa"/>
+          </w:tcPr>
+          <w:p>
+            <w:r>
+              <w:t>Powód odrzucenia oferty przez klienta jako lista rozwijana: przy oznaczeniu oferty wysłanej jako „Przegrana” zamiast wolnego tekstu pojawia się okno z listą powodów (cena, termin dostawy, wybrał konkurencję, projekt anulowany, brak odpowiedzi klienta, warunki płatności, inne). Wybór jest opcjonalny - brak wyboru zapisuje powód „Inne”, a przy „Inne” można wpisać własny powód. Powód widać w oznaczeniu przy ofercie. Oferty oznaczone wcześniej jako przegrane dostały powód „Inne” (dotychczasowa notatka zostaje). Dane są przygotowane pod późniejsze statystyki powodów odrzucenia. Wymaga uruchomienia migracji 024 na bazie przed wdrożeniem.</w:t>
+            </w:r>
+          </w:p>
+        </w:tc>
+      </w:tr>
     </w:tbl>
     <w:p>
       <w:pPr>

</xml_diff>

<commit_message>
feat: lost-reason statistics in analytics, focus-trapping Modal for new dialogs
- Analytics panel "Reasons for rejection": lost offers by reason (offers, tons, value, share)
- Shared Modal: portal, Tab focus trap, Escape/backdrop close, focus restore
- Reject and lost-reason dialogs use it; notice waits for settings, no "undefined" dimensions
- v2.0 report updated

Co-Authored-By: Claude Sonnet 5.5 <noreply@anthropic.com>
</commit_message>
<xml_diff>
--- a/Historia wersji oraz md/Historia wersji/AMSteel_Quote_Raport_Wersji_2.0.docx
+++ b/Historia wersji oraz md/Historia wersji/AMSteel_Quote_Raport_Wersji_2.0.docx
@@ -318,7 +318,7 @@
           </w:tcPr>
           <w:p>
             <w:r>
-              <w:t>Panel Starszego handlowca: rozwijana tabela pozycji z cenami oraz lista pozycji poniżej wytycznych (marża / PGL). Walidacja (zatwierdź / odrzuć) także z poziomu kalkulatora. Powód odrzucenia oferty przez klienta jako lista rozwijana (z opcją „Inne” i własnym tekstem).</w:t>
+              <w:t>Panel Starszego handlowca: rozwijana tabela pozycji z cenami oraz lista pozycji poniżej wytycznych (marża / PGL). Walidacja (zatwierdź / odrzuć) także z poziomu kalkulatora. Powód odrzucenia oferty przez klienta jako lista rozwijana (z opcją „Inne” i własnym tekstem). Statystyki powodów odrzucenia w panelu Analiza.</w:t>
             </w:r>
           </w:p>
         </w:tc>
@@ -1193,7 +1193,29 @@
           </w:tcPr>
           <w:p>
             <w:r>
-              <w:t>Powód odrzucenia oferty przez klienta jako lista rozwijana: przy oznaczeniu oferty wysłanej jako „Przegrana” zamiast wolnego tekstu pojawia się okno z listą powodów (cena, termin dostawy, wybrał konkurencję, projekt anulowany, brak odpowiedzi klienta, warunki płatności, inne). Wybór jest opcjonalny - brak wyboru zapisuje powód „Inne”, a przy „Inne” można wpisać własny powód. Powód widać w oznaczeniu przy ofercie. Oferty oznaczone wcześniej jako przegrane dostały powód „Inne” (dotychczasowa notatka zostaje). Dane są przygotowane pod późniejsze statystyki powodów odrzucenia. Wymaga uruchomienia migracji 024 na bazie przed wdrożeniem.</w:t>
+              <w:t>Powód odrzucenia oferty przez klienta jako lista rozwijana: przy oznaczeniu oferty wysłanej jako „Przegrana” zamiast wolnego tekstu pojawia się okno z listą powodów (cena, termin dostawy, wybrał konkurencję, projekt anulowany, brak odpowiedzi klienta, warunki płatności, inne). Wybór jest opcjonalny - brak wyboru zapisuje powód „Inne”, a przy „Inne” można wpisać własny powód. Powód widać w oznaczeniu przy ofercie. Oferty oznaczone wcześniej jako przegrane dostały powód „Inne” (dotychczasowa notatka zostaje). Wymaga uruchomienia migracji 024 na bazie przed wdrożeniem.</w:t>
+            </w:r>
+          </w:p>
+        </w:tc>
+      </w:tr>
+      <w:tr>
+        <w:tc>
+          <w:tcPr>
+            <w:tcW w:w="1948" w:type="dxa"/>
+          </w:tcPr>
+          <w:p>
+            <w:r>
+              <w:t>Nowa funkcja</w:t>
+            </w:r>
+          </w:p>
+        </w:tc>
+        <w:tc>
+          <w:tcPr>
+            <w:tcW w:w="6908" w:type="dxa"/>
+          </w:tcPr>
+          <w:p>
+            <w:r>
+              <w:t>Statystyki powodów odrzucenia w panelu Analiza: nowy panel „Powody odrzucenia przez klienta” pod wykresem wygranych i przegranych. Pokazuje, ile ofert (oraz ile ton i jaką wartość) przegrano z każdego powodu, wraz z udziałem procentowym - od najczęstszego powodu. Respektuje filtry panelu (okres, handlowiec, klient, typ stali) i wybraną walutę; przegrane sprzed wprowadzenia listy liczone są jako „Inne”.</w:t>
             </w:r>
           </w:p>
         </w:tc>

</xml_diff>

<commit_message>
docs: v2.0 report entry for accessible dialogs
Co-Authored-By: Claude Sonnet 5.5 <noreply@anthropic.com>
</commit_message>
<xml_diff>
--- a/Historia wersji oraz md/Historia wersji/AMSteel_Quote_Raport_Wersji_2.0.docx
+++ b/Historia wersji oraz md/Historia wersji/AMSteel_Quote_Raport_Wersji_2.0.docx
@@ -1220,6 +1220,28 @@
           </w:p>
         </w:tc>
       </w:tr>
+      <w:tr>
+        <w:tc>
+          <w:tcPr>
+            <w:tcW w:w="1948" w:type="dxa"/>
+          </w:tcPr>
+          <w:p>
+            <w:r>
+              <w:t>Poprawka</w:t>
+            </w:r>
+          </w:p>
+        </w:tc>
+        <w:tc>
+          <w:tcPr>
+            <w:tcW w:w="6908" w:type="dxa"/>
+          </w:tcPr>
+          <w:p>
+            <w:r>
+              <w:t>Dostępność nowych okien dialogowych (odrzucenie oferty przez seniora, powód odrzucenia przez klienta): klawisz Tab krąży tylko po elementach okna i nie wychodzi na stronę pod spodem, okno zamyka Escape lub kliknięcie w tło, a po zamknięciu fokus wraca na przycisk, który je otworzył. Pola mają etykiety dla czytników ekranu, a przycisk Anuluj jest zablokowany w trakcie zapisu.</w:t>
+            </w:r>
+          </w:p>
+        </w:tc>
+      </w:tr>
     </w:tbl>
     <w:p>
       <w:pPr>

</xml_diff>

<commit_message>
feat: Dashboard tab first in main nav for reviewers (senior, admin)
Co-Authored-By: Claude Sonnet 5.5 <noreply@anthropic.com>
</commit_message>
<xml_diff>
--- a/Historia wersji oraz md/Historia wersji/AMSteel_Quote_Raport_Wersji_2.0.docx
+++ b/Historia wersji oraz md/Historia wersji/AMSteel_Quote_Raport_Wersji_2.0.docx
@@ -1242,6 +1242,28 @@
           </w:p>
         </w:tc>
       </w:tr>
+      <w:tr>
+        <w:tc>
+          <w:tcPr>
+            <w:tcW w:w="1948" w:type="dxa"/>
+          </w:tcPr>
+          <w:p>
+            <w:r>
+              <w:t>Nowa funkcja</w:t>
+            </w:r>
+          </w:p>
+        </w:tc>
+        <w:tc>
+          <w:tcPr>
+            <w:tcW w:w="6908" w:type="dxa"/>
+          </w:tcPr>
+          <w:p>
+            <w:r>
+              <w:t>Przycisk „Dashboard” (🏠) jako pierwsza zakładka głównej nawigacji dla osób walidujących (senior, admin): widoczny zaraz po zalogowaniu i prowadzi do ich panelu (senior – panel walidacji, admin – pulpit). Zastępuje osobne zakładki „Panel Seniora” i „Panel Admina”, które prowadziły do tych samych stron.</w:t>
+            </w:r>
+          </w:p>
+        </w:tc>
+      </w:tr>
     </w:tbl>
     <w:p>
       <w:pPr>

</xml_diff>

<commit_message>
docs: v2.0 report, README and start script for the flow model; UI review fixes
- report 2.0: entries for flows, roles, rules engine, validation queue,
  admin panels and migration of legacy accounts (backup kept)
- README: 2.0 section, workflow/analytics/team text, setup for superuser,
  seeded test accounts, npm test
- steelquote-start.ps1 lists the seeded account per role
- UI: one shared /api/auth/me fetch, PGL/margin locks fail closed while
  loading, team editor only for approvers, toggle buttons instead of
  half-done tabs, safe flow switch, mobile truncation

Co-Authored-By: Claude Opus 5.5 <noreply@anthropic.com>
</commit_message>
<xml_diff>
--- a/Historia wersji oraz md/Historia wersji/AMSteel_Quote_Raport_Wersji_2.0.docx
+++ b/Historia wersji oraz md/Historia wersji/AMSteel_Quote_Raport_Wersji_2.0.docx
@@ -318,7 +318,7 @@
           </w:tcPr>
           <w:p>
             <w:r>
-              <w:t>Panel Starszego handlowca: rozwijana tabela pozycji z cenami oraz lista pozycji poniżej wytycznych (marża / PGL). Walidacja (zatwierdź / odrzuć) także z poziomu kalkulatora. Powód odrzucenia oferty przez klienta jako lista rozwijana (z opcją „Inne” i własnym tekstem). Statystyki powodów odrzucenia w panelu Analiza.</w:t>
+              <w:t>Panel Starszego handlowca: rozwijana tabela pozycji z cenami oraz lista pozycji poniżej wytycznych (marża / PGL). Walidacja (zatwierdź / odrzuć) także z poziomu kalkulatora. Powód odrzucenia oferty przez klienta jako lista rozwijana (z opcją „Inne” i własnym tekstem). Statystyki powodów odrzucenia w panelu Analiza. Przebudowa uprawnień: konfigurowalne flowy, role, poziomy hierarchii, reguły walidacji z symulatorem i macierz widoczności (panel „Uprawnienia”).</w:t>
             </w:r>
           </w:p>
         </w:tc>
@@ -949,13 +949,87 @@
           <w:tcPr>
             <w:tcW w:w="1948" w:type="dxa"/>
           </w:tcPr>
-          <w:p/>
+          <w:p>
+            <w:r>
+              <w:t>Nowa funkcja</w:t>
+            </w:r>
+          </w:p>
         </w:tc>
         <w:tc>
           <w:tcPr>
             <w:tcW w:w="6908" w:type="dxa"/>
           </w:tcPr>
-          <w:p/>
+          <w:p>
+            <w:r>
+              <w:t>Konfigurowalny model uprawnień zamiast stałych ról junior / senior / admin: flowy procesowe, poziomy hierarchii (N0, N+1, N+2, N+3, NPR), role z sześcioma uprawnieniami funkcjonalnymi ustawianymi osobno w każdym flow, przypisania użytkowników do flow, reguły walidacji i macierz widoczności. Dane startowe zgodne z formularzem uprawnień i walidacji ofert z 22.09.2026 (Flow 1 - DYSTR, Flow 2 - PROJEKTY; CEO w Flow 2 na poziomie N+2).</w:t>
+            </w:r>
+          </w:p>
+        </w:tc>
+      </w:tr>
+      <w:tr>
+        <w:tc>
+          <w:tcPr>
+            <w:tcW w:w="1948" w:type="dxa"/>
+          </w:tcPr>
+          <w:p>
+            <w:r>
+              <w:t>Zmiana</w:t>
+            </w:r>
+          </w:p>
+        </w:tc>
+        <w:tc>
+          <w:tcPr>
+            <w:tcW w:w="6908" w:type="dxa"/>
+          </w:tcPr>
+          <w:p>
+            <w:r>
+              <w:t>Migracja istniejących kont bez utraty haseł, sesji i historii: junior -&gt; Flow 1 / Internal Front Office, senior -&gt; Flow 1 / Area Sales Manager (zespół zachowany), admin -&gt; Administrator. Wszystkie dotychczasowe oferty przypisane do Flow 1. Nowe konto zakładane przez administratora nie ma dostępu, dopóki nie zostanie przypisane do flow i roli.</w:t>
+            </w:r>
+          </w:p>
+        </w:tc>
+      </w:tr>
+      <w:tr>
+        <w:tc>
+          <w:tcPr>
+            <w:tcW w:w="1948" w:type="dxa"/>
+          </w:tcPr>
+          <w:p>
+            <w:r>
+              <w:t>Bezpieczeństwo</w:t>
+            </w:r>
+          </w:p>
+        </w:tc>
+        <w:tc>
+          <w:tcPr>
+            <w:tcW w:w="6908" w:type="dxa"/>
+          </w:tcPr>
+          <w:p>
+            <w:r>
+              <w:t>Uprawnienia sprawdzane przy każdym żądaniu na podstawie aktualnej konfiguracji w bazie (w kodzie nie ma już nazw ról). Widoczność ofert egzekwowana po stronie serwera dla list ofert, kolejki walidacji i panelu Analiza. Nikt nie zatwierdza własnej oferty, starsze wersje oferty są tylko do odczytu, żądania zmieniające dane z obcej domeny są odrzucane.</w:t>
+            </w:r>
+          </w:p>
+        </w:tc>
+      </w:tr>
+      <w:tr>
+        <w:tc>
+          <w:tcPr>
+            <w:tcW w:w="1948" w:type="dxa"/>
+          </w:tcPr>
+          <w:p>
+            <w:r>
+              <w:t>Nowa funkcja</w:t>
+            </w:r>
+          </w:p>
+        </w:tc>
+        <w:tc>
+          <w:tcPr>
+            <w:tcW w:w="6908" w:type="dxa"/>
+          </w:tcPr>
+          <w:p>
+            <w:r>
+              <w:t>Automatyczne testy silnika reguł (npm test) obejmujące scenariusze T1-T5 z arkusza SYMULATOR oraz przypadki brzegowe (błędne daty ważności, wyzerowana wartość pozycji, eskalacja NPR).</w:t>
+            </w:r>
+          </w:p>
         </w:tc>
       </w:tr>
     </w:tbl>
@@ -1032,13 +1106,21 @@
           <w:tcPr>
             <w:tcW w:w="1948" w:type="dxa"/>
           </w:tcPr>
-          <w:p/>
+          <w:p>
+            <w:r>
+              <w:t>Zmiana</w:t>
+            </w:r>
+          </w:p>
         </w:tc>
         <w:tc>
           <w:tcPr>
             <w:tcW w:w="6908" w:type="dxa"/>
           </w:tcPr>
-          <w:p/>
+          <w:p>
+            <w:r>
+              <w:t>Pola bazy PGL oraz ceny / marży są zablokowane, gdy rola w danym flow nie ma takiego uprawnienia (np. Front Office we Flow 1 nie zmienia bazy PGL). Serwer odrzuca niedozwoloną zmianę także przy zapisie z pominięciem interfejsu.</w:t>
+            </w:r>
+          </w:p>
         </w:tc>
       </w:tr>
     </w:tbl>
@@ -1264,6 +1346,72 @@
           </w:p>
         </w:tc>
       </w:tr>
+      <w:tr>
+        <w:tc>
+          <w:tcPr>
+            <w:tcW w:w="1948" w:type="dxa"/>
+          </w:tcPr>
+          <w:p>
+            <w:r>
+              <w:t>Nowa funkcja</w:t>
+            </w:r>
+          </w:p>
+        </w:tc>
+        <w:tc>
+          <w:tcPr>
+            <w:tcW w:w="6908" w:type="dxa"/>
+          </w:tcPr>
+          <w:p>
+            <w:r>
+              <w:t>Silnik reguł walidacji: przy wysyłce do walidacji wymagany poziom akceptacji to najwyższy poziom spośród spełnionych reguł (marża poniżej zakładanej 4,5% -&gt; N+1, niedobór marży co najmniej 2,1 p.p. -&gt; N+2, obniżenie bazy wyceny -&gt; NPR, termin ważności powyżej 48h, ważność ceny kwartał / dłużej niż kwartał, wartość oferty powyżej 1 000 000 EUR). Reguła NPR to dodatkowa, równoległa akceptacja. Gdy żadna reguła nie jest spełniona albo poziom twórcy ją pokrywa, oferta może wyjść do klienta bez walidacji.</w:t>
+            </w:r>
+          </w:p>
+        </w:tc>
+      </w:tr>
+      <w:tr>
+        <w:tc>
+          <w:tcPr>
+            <w:tcW w:w="1948" w:type="dxa"/>
+          </w:tcPr>
+          <w:p>
+            <w:r>
+              <w:t>Nowa funkcja</w:t>
+            </w:r>
+          </w:p>
+        </w:tc>
+        <w:tc>
+          <w:tcPr>
+            <w:tcW w:w="6908" w:type="dxa"/>
+          </w:tcPr>
+          <w:p>
+            <w:r>
+              <w:t>Kolejka „Do walidacji”: oferta trafia do wszystkich osób z rolą na wymaganym poziomie w danym flow. Walidujący może ofertę edytować (reguły liczą się ponownie i mogą podnieść poziom), odrzucić z instrukcją dla handlowca, zatwierdzić albo zatwierdzić i od razu wysłać do klienta w imieniu handlowca (zapisywane jest, kto wysłał).</w:t>
+            </w:r>
+          </w:p>
+        </w:tc>
+      </w:tr>
+      <w:tr>
+        <w:tc>
+          <w:tcPr>
+            <w:tcW w:w="1948" w:type="dxa"/>
+          </w:tcPr>
+          <w:p>
+            <w:r>
+              <w:t>Nowa funkcja</w:t>
+            </w:r>
+          </w:p>
+        </w:tc>
+        <w:tc>
+          <w:tcPr>
+            <w:tcW w:w="6908" w:type="dxa"/>
+          </w:tcPr>
+          <w:p>
+            <w:r>
+              <w:t>Konflikt konfiguracji (scenariusz T5): gdy reguła wymaga poziomu, którego nie ma w danym flow, oferta jest eskalowana do najbliższego wyższego istniejącego poziomu z widoczną adnotacją. Administrator może zamiast tego wybrać blokadę wysyłki albo eskalację do najwyższego poziomu.</w:t>
+            </w:r>
+          </w:p>
+        </w:tc>
+      </w:tr>
     </w:tbl>
     <w:p>
       <w:pPr>
@@ -1419,15 +1567,67 @@
       <w:tr>
         <w:tc>
           <w:tcPr>
-            <w:tcW w:w="1963" w:type="dxa"/>
+            <w:tcW w:w="1948" w:type="dxa"/>
           </w:tcPr>
-          <w:p/>
+          <w:p>
+            <w:r>
+              <w:t>Nowa funkcja</w:t>
+            </w:r>
+          </w:p>
         </w:tc>
         <w:tc>
           <w:tcPr>
-            <w:tcW w:w="6893" w:type="dxa"/>
+            <w:tcW w:w="6908" w:type="dxa"/>
           </w:tcPr>
-          <w:p/>
+          <w:p>
+            <w:r>
+              <w:t>Panel „Uprawnienia” w panelu administratora: flowy i ich członkowie, role i poziomy hierarchii z uprawnieniami, edytor reguł walidacji z kontrolą kompletności konfiguracji (progi „do uzupełnienia”), symulator wymaganej walidacji z gotowymi scenariuszami T1-T5 oraz macierz widoczności z wyliczanym na bieżąco efektywnym zakresem.</w:t>
+            </w:r>
+          </w:p>
+        </w:tc>
+      </w:tr>
+      <w:tr>
+        <w:tc>
+          <w:tcPr>
+            <w:tcW w:w="1948" w:type="dxa"/>
+          </w:tcPr>
+          <w:p>
+            <w:r>
+              <w:t>Nowa funkcja</w:t>
+            </w:r>
+          </w:p>
+        </w:tc>
+        <w:tc>
+          <w:tcPr>
+            <w:tcW w:w="6908" w:type="dxa"/>
+          </w:tcPr>
+          <w:p>
+            <w:r>
+              <w:t>Panel Handlowcy: przypisanie osoby do roli w każdym flow, przełącznik Administratora, filtr po flow oraz widok piramidy (struktura organizacyjna flow: poziomy N0-N+3, NPR jako poziom równoległy, Administrator poza piramidą).</w:t>
+            </w:r>
+          </w:p>
+        </w:tc>
+      </w:tr>
+      <w:tr>
+        <w:tc>
+          <w:tcPr>
+            <w:tcW w:w="1948" w:type="dxa"/>
+          </w:tcPr>
+          <w:p>
+            <w:r>
+              <w:t>Nowa funkcja</w:t>
+            </w:r>
+          </w:p>
+        </w:tc>
+        <w:tc>
+          <w:tcPr>
+            <w:tcW w:w="6908" w:type="dxa"/>
+          </w:tcPr>
+          <w:p>
+            <w:r>
+              <w:t>Przełącznik aktywnego flow w nawigacji dla osób przypisanych do kilku flow oraz plakietka z rolą i poziomem. Nowe teksty interfejsu w czterech językach (PL / EN / CS / DE).</w:t>
+            </w:r>
+          </w:p>
         </w:tc>
       </w:tr>
     </w:tbl>
@@ -1512,6 +1712,14 @@
       </w:pPr>
       <w:r>
         <w:t>Ręczne testy sekcji „Trasa i transport” na środowisku produkcyjnym: adresy z kartoteki klienta, przekroczenie ładowności (dwa kursy), elementy ponadwymiarowe, tryb ręczny oraz zachowanie przy niedostępnym serwisie map.</w:t>
+      </w:r>
+    </w:p>
+    <w:p>
+      <w:pPr>
+        <w:pStyle w:val="Listapunktowana"/>
+      </w:pPr>
+      <w:r>
+        <w:t>Uzupełnienie przez biznes progów oznaczonych „do uzupełnienia” (marża N+3, obniżenie bazy N+2 / N+3, ważność N+3) w panelu Uprawnienia oraz testy end-to-end nowego obiegu walidacji po wdrożeniu na produkcję.</w:t>
       </w:r>
     </w:p>
     <w:p>

</xml_diff>

<commit_message>
docs: open questions on the flow model for business; v2.0 report known issues
- questions_for_lukasz.md: plain-language Polish list of spec gaps and collisions
  (who approves what, rules, visibility), each with the current default.
- flows-v2-plan.md: technical open questions and follow-ups.
- v2.0 report: known issues (client-side totals, no branch/region model, open
  business questions) and a plans bullet; backup kept.

Co-Authored-By: Claude Opus 5.5 <noreply@anthropic.com>
</commit_message>
<xml_diff>
--- a/Historia wersji oraz md/Historia wersji/AMSteel_Quote_Raport_Wersji_2.0.docx
+++ b/Historia wersji oraz md/Historia wersji/AMSteel_Quote_Raport_Wersji_2.0.docx
@@ -1679,6 +1679,30 @@
     </w:p>
     <w:p>
       <w:pPr>
+        <w:pStyle w:val="Listapunktowana"/>
+      </w:pPr>
+      <w:r>
+        <w:t>Wartość i marża oferty są nadal wyliczane w przeglądarce handlowca; serwer odrzuca tylko oczywiste nieprawidłowości (np. wyzerowaną wartość pozycji). Pełne przeliczenie cen po stronie serwera - do zrobienia.</w:t>
+      </w:r>
+    </w:p>
+    <w:p>
+      <w:pPr>
+        <w:pStyle w:val="Listapunktowana"/>
+      </w:pPr>
+      <w:r>
+        <w:t>Brak w aplikacji struktury oddziałów i regionów - kolumny „Oferty oddziału” i „Oferty regionu” w macierzy widoczności działają obecnie jak „Oferty zespołu”, a oferty do walidacji trafiają do wspólnej kolejki danego poziomu we flow (ustawienie w panelu Uprawnienia pozwala zamiast tego pokazać cały flow).</w:t>
+      </w:r>
+    </w:p>
+    <w:p>
+      <w:pPr>
+        <w:pStyle w:val="Listapunktowana"/>
+      </w:pPr>
+      <w:r>
+        <w:t>Część zasad formularza uprawnień jest niejednoznaczna lub wzajemnie sprzeczna (m.in. poziom CEO w Flow 2, kto zatwierdza obniżenie bazy, sposób liczenia marży i kwartału, opisy widoczności niezgodne z zaznaczeniami). Lista pytań do biznesu: „Historia wersji oraz md/questions_for_lukasz.md”; do czasu odpowiedzi działają przyjęte założenia opisane w tym pliku.</w:t>
+      </w:r>
+    </w:p>
+    <w:p>
+      <w:pPr>
         <w:spacing w:before="200" w:after="120"/>
       </w:pPr>
       <w:r>
@@ -1720,6 +1744,14 @@
       </w:pPr>
       <w:r>
         <w:t>Uzupełnienie przez biznes progów oznaczonych „do uzupełnienia” (marża N+3, obniżenie bazy N+2 / N+3, ważność N+3) w panelu Uprawnienia oraz testy end-to-end nowego obiegu walidacji po wdrożeniu na produkcję.</w:t>
+      </w:r>
+    </w:p>
+    <w:p>
+      <w:pPr>
+        <w:pStyle w:val="Listapunktowana"/>
+      </w:pPr>
+      <w:r>
+        <w:t>Omówienie z biznesem listy otwartych pytań do modelu uprawnień (questions_for_lukasz.md) i naniesienie odpowiedzi w panelu Uprawnienia (progi, poziomy, widoczność).</w:t>
       </w:r>
     </w:p>
     <w:p>

</xml_diff>

<commit_message>
docs: v2.0 report - verifier tiles, PGL / margin % columns, settings shortcut, item validation
Co-Authored-By: Claude Opus 5.5 <noreply@anthropic.com>
</commit_message>
<xml_diff>
--- a/Historia wersji oraz md/Historia wersji/AMSteel_Quote_Raport_Wersji_2.0.docx
+++ b/Historia wersji oraz md/Historia wersji/AMSteel_Quote_Raport_Wersji_2.0.docx
@@ -318,7 +318,7 @@
           </w:tcPr>
           <w:p>
             <w:r>
-              <w:t>Panel Starszego handlowca: rozwijana tabela pozycji z cenami oraz lista pozycji poniżej wytycznych (marża / PGL). Walidacja (zatwierdź / odrzuć) także z poziomu kalkulatora. Powód odrzucenia oferty przez klienta jako lista rozwijana (z opcją „Inne” i własnym tekstem). Statystyki powodów odrzucenia w panelu Analiza. Przebudowa uprawnień: konfigurowalne flowy, role, poziomy hierarchii, reguły walidacji z symulatorem i macierz widoczności (panel „Uprawnienia”).</w:t>
+              <w:t>Panel Starszego handlowca: rozwijana tabela pozycji z cenami oraz lista pozycji poniżej wytycznych (marża / PGL). Walidacja (zatwierdź / odrzuć) także z poziomu kalkulatora. Powód odrzucenia oferty przez klienta jako lista rozwijana (z opcją „Inne” i własnym tekstem). Statystyki powodów odrzucenia w panelu Analiza. Przebudowa uprawnień: konfigurowalne flowy, role, poziomy hierarchii, reguły walidacji z symulatorem i macierz widoczności (panel „Uprawnienia”). Kafelki statusów w panelu weryfikującego, kolumna PGL i marża % w zestawieniu, skrót do ustawień dla administratora, walidacja spójności pozycji oferty po stronie serwera.</w:t>
             </w:r>
           </w:p>
         </w:tc>
@@ -1032,6 +1032,28 @@
           </w:p>
         </w:tc>
       </w:tr>
+      <w:tr>
+        <w:tc>
+          <w:tcPr>
+            <w:tcW w:w="1948" w:type="dxa"/>
+          </w:tcPr>
+          <w:p>
+            <w:r>
+              <w:t>Bezpieczeństwo</w:t>
+            </w:r>
+          </w:p>
+        </w:tc>
+        <w:tc>
+          <w:tcPr>
+            <w:tcW w:w="6908" w:type="dxa"/>
+          </w:tcPr>
+          <w:p>
+            <w:r>
+              <w:t>Serwer sprawdza kompletność i spójność każdej pozycji przy zapisie oferty: gatunek, wymiary, tonaż oraz zgodność kwot (marża = (PGL + Σ Huta) × marża %, cena = PGL + Σ Huta + marża + dopłata + transport + Σ SSC, wartość = cena × tony). Oferta z niespójnymi wartościami jest odrzucana z komunikatem wskazującym pozycję. Przyczyna błędnych ofert testowych „SMOKE” (pozycje bez gatunku i wymiarów, cena 0 €/t przy wartości 100 €); dane testowe przeliczono poprawnie. Testy automatyczne z przykładem liczbowym (645 + 46, marża 7% = 48,37 → cena 814,37 €/t).</w:t>
+            </w:r>
+          </w:p>
+        </w:tc>
+      </w:tr>
     </w:tbl>
     <w:p>
       <w:pPr>
@@ -1119,6 +1141,28 @@
           <w:p>
             <w:r>
               <w:t>Pola bazy PGL oraz ceny / marży są zablokowane, gdy rola w danym flow nie ma takiego uprawnienia (np. Front Office we Flow 1 nie zmienia bazy PGL). Serwer odrzuca niedozwoloną zmianę także przy zapisie z pominięciem interfejsu.</w:t>
+            </w:r>
+          </w:p>
+        </w:tc>
+      </w:tr>
+      <w:tr>
+        <w:tc>
+          <w:tcPr>
+            <w:tcW w:w="1948" w:type="dxa"/>
+          </w:tcPr>
+          <w:p>
+            <w:r>
+              <w:t>Nowa funkcja</w:t>
+            </w:r>
+          </w:p>
+        </w:tc>
+        <w:tc>
+          <w:tcPr>
+            <w:tcW w:w="6908" w:type="dxa"/>
+          </w:tcPr>
+          <w:p>
+            <w:r>
+              <w:t>Zestawienie: nowa kolumna PGL oraz marża pokazywana jako kwota i procent (np. 73,22 / 7%). Kolumny ceny, tonażu i wartości nie zawijają się na węższych ekranach.</w:t>
             </w:r>
           </w:p>
         </w:tc>
@@ -1408,6 +1452,28 @@
           <w:p>
             <w:r>
               <w:t>Konflikt konfiguracji (scenariusz T5): gdy reguła wymaga poziomu, którego nie ma w danym flow, oferta jest eskalowana do najbliższego wyższego istniejącego poziomu z widoczną adnotacją. Administrator może zamiast tego wybrać blokadę wysyłki albo eskalację do najwyższego poziomu.</w:t>
+            </w:r>
+          </w:p>
+        </w:tc>
+      </w:tr>
+      <w:tr>
+        <w:tc>
+          <w:tcPr>
+            <w:tcW w:w="1948" w:type="dxa"/>
+          </w:tcPr>
+          <w:p>
+            <w:r>
+              <w:t>Nowa funkcja</w:t>
+            </w:r>
+          </w:p>
+        </w:tc>
+        <w:tc>
+          <w:tcPr>
+            <w:tcW w:w="6908" w:type="dxa"/>
+          </w:tcPr>
+          <w:p>
+            <w:r>
+              <w:t>Panel weryfikującego: klikalne kafelki jak w panelu administratora - „Oczekujące na weryfikację”, „Oczekujące na wysłanie” oraz oferty wg statusu. Kliknięcie filtruje listę i przewija do ofert z akcjami (zatwierdź / odrzuć / wyślij).</w:t>
             </w:r>
           </w:p>
         </w:tc>
@@ -1630,6 +1696,28 @@
           </w:p>
         </w:tc>
       </w:tr>
+      <w:tr>
+        <w:tc>
+          <w:tcPr>
+            <w:tcW w:w="1948" w:type="dxa"/>
+          </w:tcPr>
+          <w:p>
+            <w:r>
+              <w:t>Nowa funkcja</w:t>
+            </w:r>
+          </w:p>
+        </w:tc>
+        <w:tc>
+          <w:tcPr>
+            <w:tcW w:w="6908" w:type="dxa"/>
+          </w:tcPr>
+          <w:p>
+            <w:r>
+              <w:t>Przycisk ⚙️ Ustawienia obok flag języka na każdej stronie - skrót do ustawień dla administratora, od razu po zalogowaniu.</w:t>
+            </w:r>
+          </w:p>
+        </w:tc>
+      </w:tr>
     </w:tbl>
     <w:p>
       <w:pPr>
@@ -1682,7 +1770,7 @@
         <w:pStyle w:val="Listapunktowana"/>
       </w:pPr>
       <w:r>
-        <w:t>Wartość i marża oferty są nadal wyliczane w przeglądarce handlowca; serwer odrzuca tylko oczywiste nieprawidłowości (np. wyzerowaną wartość pozycji). Pełne przeliczenie cen po stronie serwera - do zrobienia.</w:t>
+        <w:t>Wartość i marża oferty są nadal wyliczane w przeglądarce handlowca; serwer sprawdza kompletność i spójność kwot w pozycjach (cena i wartość muszą wynikać z PGL, dopłat, marży i tonażu), ale nie przelicza ich od nowa według aktualnych ustawień. Pełne przeliczenie cen po stronie serwera - do zrobienia.</w:t>
       </w:r>
     </w:p>
     <w:p>

</xml_diff>

<commit_message>
fix: re-route an approval when current rules need a higher level
Approval steps are planned once, at submit. When the rules or the data
changed since (or for legacy offers backfilled with an N+1 step), a lower
level could sign off an offer that now needs a higher one. The approve
route now re-runs the rules first: if the fresh plan needs a level the
current round does not cover, pending steps are superseded and re-planned
(approved ones keep counting, levels are never lowered) and the caller
gets 409 rerouted instead of an approval.

Worked example: submitted at 4.0 % margin (0.5 pp deficit -> N+1), now
2.4 % (2.1 pp deficit -> N+2): ASM can no longer approve it.

Also: rerouted error in PL/EN/DE/CS, lists and review bar refresh after a
re-route, vitest cases for uncoveredSteps, v2.0 report updated.

Co-Authored-By: Claude Opus 5.5 <noreply@anthropic.com>
</commit_message>
<xml_diff>
--- a/Historia wersji oraz md/Historia wersji/AMSteel_Quote_Raport_Wersji_2.0.docx
+++ b/Historia wersji oraz md/Historia wersji/AMSteel_Quote_Raport_Wersji_2.0.docx
@@ -1474,6 +1474,28 @@
           <w:p>
             <w:r>
               <w:t>Panel weryfikującego: klikalne kafelki jak w panelu administratora - „Oczekujące na weryfikację”, „Oczekujące na wysłanie” oraz oferty wg statusu. Kliknięcie filtruje listę i przewija do ofert z akcjami (zatwierdź / odrzuć / wyślij).</w:t>
+            </w:r>
+          </w:p>
+        </w:tc>
+      </w:tr>
+      <w:tr>
+        <w:tc>
+          <w:tcPr>
+            <w:tcW w:w="1948" w:type="dxa"/>
+          </w:tcPr>
+          <w:p>
+            <w:r>
+              <w:t>Poprawka</w:t>
+            </w:r>
+          </w:p>
+        </w:tc>
+        <w:tc>
+          <w:tcPr>
+            <w:tcW w:w="6908" w:type="dxa"/>
+          </w:tcPr>
+          <w:p>
+            <w:r>
+              <w:t>Zatwierdzenie oferty ponownie sprawdza aktualne reguły. Wymagany poziom akceptacji jest zapisywany w chwili wysyłki do walidacji, więc po zmianie reguł (a także dla ofert przeniesionych z wersji 1.x z krokiem N+1) niższy poziom mógł zatwierdzić ofertę, która według dzisiejszych reguł wymaga wyższego. Teraz, jeśli reguły wymagają poziomu, którego oferta nie ma, zatwierdzenie nie dochodzi do skutku: oferta jest przekierowana na właściwy poziom, a walidujący widzi komunikat. Kroki już zatwierdzone (np. NPR) pozostają ważne, a poziom nigdy nie jest obniżany. Przykład: oferta wysłana przy marży 4,0% (niedobór 0,5 pp -&gt; N+1), a dziś z marżą 2,4% (niedobór 2,1 pp) wymaga N+2 - ASM nie może jej już zatwierdzić. Na danych testowych dotyczy to 6 starszych ofert, które trafiłyby do N+2 + NPR.</w:t>
             </w:r>
           </w:p>
         </w:tc>
@@ -1787,6 +1809,14 @@
       </w:pPr>
       <w:r>
         <w:t>Część zasad formularza uprawnień jest niejednoznaczna lub wzajemnie sprzeczna (m.in. poziom CEO w Flow 2, kto zatwierdza obniżenie bazy, sposób liczenia marży i kwartału, opisy widoczności niezgodne z zaznaczeniami). Lista pytań do biznesu: „Historia wersji oraz md/questions_for_lukasz.md”; do czasu odpowiedzi działają przyjęte założenia opisane w tym pliku.</w:t>
+      </w:r>
+    </w:p>
+    <w:p>
+      <w:pPr>
+        <w:pStyle w:val="Listapunktowana"/>
+      </w:pPr>
+      <w:r>
+        <w:t>Ocena reguł uruchamia kilka zapytań równolegle na jednym połączeniu z bazą w transakcji - działa poprawnie, ale sterownik pg zgłasza ostrzeżenie o wycofaniu; do przebudowy przed aktualizacją sterownika do wersji 9</w:t>
       </w:r>
     </w:p>
     <w:p>

</xml_diff>

<commit_message>
docs: v2.0 report - read-only sent offers, renegotiation of lost offers, analytics counting
Co-Authored-By: Claude Opus 5.5 <noreply@anthropic.com>
</commit_message>
<xml_diff>
--- a/Historia wersji oraz md/Historia wersji/AMSteel_Quote_Raport_Wersji_2.0.docx
+++ b/Historia wersji oraz md/Historia wersji/AMSteel_Quote_Raport_Wersji_2.0.docx
@@ -318,7 +318,7 @@
           </w:tcPr>
           <w:p>
             <w:r>
-              <w:t>Panel Starszego handlowca: rozwijana tabela pozycji z cenami oraz lista pozycji poniżej wytycznych (marża / PGL). Walidacja (zatwierdź / odrzuć) także z poziomu kalkulatora. Powód odrzucenia oferty przez klienta jako lista rozwijana (z opcją „Inne” i własnym tekstem). Statystyki powodów odrzucenia w panelu Analiza. Przebudowa uprawnień: konfigurowalne flowy, role, poziomy hierarchii, reguły walidacji z symulatorem i macierz widoczności (panel „Uprawnienia”). Kafelki statusów w panelu weryfikującego, kolumna PGL i marża % w zestawieniu, skrót do ustawień dla administratora, walidacja spójności pozycji oferty po stronie serwera.</w:t>
+              <w:t>Panel Starszego handlowca: rozwijana tabela pozycji z cenami oraz lista pozycji poniżej wytycznych (marża / PGL). Walidacja (zatwierdź / odrzuć) także z poziomu kalkulatora. Powód odrzucenia oferty przez klienta jako lista rozwijana (z opcją „Inne” i własnym tekstem). Statystyki powodów odrzucenia w panelu Analiza. Przebudowa uprawnień: konfigurowalne flowy, role, poziomy hierarchii, reguły walidacji z symulatorem i macierz widoczności (panel „Uprawnienia”). Kafelki statusów w panelu weryfikującego, kolumna PGL i marża % w zestawieniu, skrót do ustawień dla administratora, walidacja spójności pozycji oferty po stronie serwera. Oferty wysłane da się otworzyć w trybie podglądu; ofertę przegraną można renegocjować jako kolejną wersję tej samej oferty, a analityka liczy całą renegocjację jako jedną ofertę (wynik ostatniej rundy).</w:t>
             </w:r>
           </w:p>
         </w:tc>
@@ -1496,6 +1496,72 @@
           <w:p>
             <w:r>
               <w:t>Zatwierdzenie oferty ponownie sprawdza aktualne reguły. Wymagany poziom akceptacji jest zapisywany w chwili wysyłki do walidacji, więc po zmianie reguł (a także dla ofert przeniesionych z wersji 1.x z krokiem N+1) niższy poziom mógł zatwierdzić ofertę, która według dzisiejszych reguł wymaga wyższego. Teraz, jeśli reguły wymagają poziomu, którego oferta nie ma, zatwierdzenie nie dochodzi do skutku: oferta jest przekierowana na właściwy poziom, a walidujący widzi komunikat. Kroki już zatwierdzone (np. NPR) pozostają ważne, a poziom nigdy nie jest obniżany. Przykład: oferta wysłana przy marży 4,0% (niedobór 0,5 pp -&gt; N+1), a dziś z marżą 2,4% (niedobór 2,1 pp) wymaga N+2 - ASM nie może jej już zatwierdzić. Na danych testowych dotyczy to 6 starszych ofert, które trafiłyby do N+2 + NPR.</w:t>
+            </w:r>
+          </w:p>
+        </w:tc>
+      </w:tr>
+      <w:tr>
+        <w:tc>
+          <w:tcPr>
+            <w:tcW w:w="1948" w:type="dxa"/>
+          </w:tcPr>
+          <w:p>
+            <w:r>
+              <w:t>Poprawka</w:t>
+            </w:r>
+          </w:p>
+        </w:tc>
+        <w:tc>
+          <w:tcPr>
+            <w:tcW w:w="6908" w:type="dxa"/>
+          </w:tcPr>
+          <w:p>
+            <w:r>
+              <w:t>Nie dało się wejść w ofertę już wysłaną do klienta - kliknięcie wiersza na liście „Moje oferty” (oraz w panelu administratora, także w poprzednich wersjach) nic nie robiło. Teraz każda widoczna oferta się otwiera; oferta wysłana otwiera się w kalkulatorze w trybie „Podgląd (tylko do odczytu)”: szary pasek informacyjny, bez przycisku Zapisz, eksport PDF / Excel nadal dostępny, a przeglądanie nie wywołuje ostrzeżenia o niezapisanych zmianach.</w:t>
+            </w:r>
+          </w:p>
+        </w:tc>
+      </w:tr>
+      <w:tr>
+        <w:tc>
+          <w:tcPr>
+            <w:tcW w:w="1948" w:type="dxa"/>
+          </w:tcPr>
+          <w:p>
+            <w:r>
+              <w:t>Nowa funkcja</w:t>
+            </w:r>
+          </w:p>
+        </w:tc>
+        <w:tc>
+          <w:tcPr>
+            <w:tcW w:w="6908" w:type="dxa"/>
+          </w:tcPr>
+          <w:p>
+            <w:r>
+              <w:t>Renegocjacja oferty przegranej: ofertę oznaczoną jako „Przegrana” (najnowszą wersję) można edytować - właściciel lub administrator. Kalkulator pokazuje pomarańczowy pasek „Renegocjacja”, a zapis tworzy nową wersję tej samej oferty (np. offer_30 -&gt; offer_30.1) jako szkic z decyzją klienta wyzerowaną do „oczekuje”; nowa runda przechodzi zwykłą walidację i wysyłkę. Oferty wygrane, oczekujące na odpowiedź klienta i starsze wersje pozostają tylko do odczytu (blokada także po stronie serwera), a decyzję klienta można zapisać wyłącznie na najnowszej wersji.</w:t>
+            </w:r>
+          </w:p>
+        </w:tc>
+      </w:tr>
+      <w:tr>
+        <w:tc>
+          <w:tcPr>
+            <w:tcW w:w="1948" w:type="dxa"/>
+          </w:tcPr>
+          <w:p>
+            <w:r>
+              <w:t>Zmiana</w:t>
+            </w:r>
+          </w:p>
+        </w:tc>
+        <w:tc>
+          <w:tcPr>
+            <w:tcW w:w="6908" w:type="dxa"/>
+          </w:tcPr>
+          <w:p>
+            <w:r>
+              <w:t>Analityka liczy renegocjację jako jedną ofertę: cała rodzina wersji to jedna oferta, a jej wynik to wynik ostatniej rundy. Przykład: 3 rundy przegrane i 4. wygrana = 1 oferta wygrana (tonaż i wartość z ostatniej wersji); 4 rundy przegrane = 1 oferta przegrana. Liczniki ofert w panelu Handlowcy (łącznie / oczekujące / wysłane) również liczą rodziny ofert zamiast pojedynczych wersji. Zweryfikowano testem end-to-end (47 sprawdzeń) i porównaniem z bazą danych.</w:t>
             </w:r>
           </w:p>
         </w:tc>

</xml_diff>

<commit_message>
feat: salespeople pyramid shows who reports to whom
The pyramid view on /admin/handlowcy becomes a person-level org chart:
one card per person in level tiers, lines from each team leader to their
team members (team_members, many-to-many), click to trace a person's whole
upline and downline, "No team leader" flag below the top tier. Table view
unchanged. Graph logic in lib/access/orgChart.ts with tests; i18n strings
landed earlier in 7fc1117. v2.0 report updated.

Co-Authored-By: Claude Opus 5.5 <noreply@anthropic.com>
</commit_message>
<xml_diff>
--- a/Historia wersji oraz md/Historia wersji/AMSteel_Quote_Raport_Wersji_2.0.docx
+++ b/Historia wersji oraz md/Historia wersji/AMSteel_Quote_Raport_Wersji_2.0.docx
@@ -318,7 +318,7 @@
           </w:tcPr>
           <w:p>
             <w:r>
-              <w:t>Panel Starszego handlowca: rozwijana tabela pozycji z cenami oraz lista pozycji poniżej wytycznych (marża / PGL). Walidacja (zatwierdź / odrzuć) także z poziomu kalkulatora. Powód odrzucenia oferty przez klienta jako lista rozwijana (z opcją „Inne” i własnym tekstem). Statystyki powodów odrzucenia w panelu Analiza. Przebudowa uprawnień: konfigurowalne flowy, role, poziomy hierarchii, reguły walidacji z symulatorem i macierz widoczności (panel „Uprawnienia”). Kafelki statusów w panelu weryfikującego, kolumna PGL i marża % w zestawieniu, skrót do ustawień dla administratora, walidacja spójności pozycji oferty po stronie serwera. Oferty wysłane da się otworzyć w trybie podglądu; ofertę przegraną można renegocjować jako kolejną wersję tej samej oferty, a analityka liczy całą renegocjację jako jedną ofertę (wynik ostatniej rundy). Odpowiedzi biznesu do modelu uprawnień wdrożone: Head of Projects zastępuje N+1 i N+2, zastępstwo wyższego poziomu, wysyłka tylko przez twórcę oferty, zatwierdzenie ważne 48 h, reguła marży N+2 = 2,1% lub mniej.</w:t>
+              <w:t>Panel Starszego handlowca: rozwijana tabela pozycji z cenami oraz lista pozycji poniżej wytycznych (marża / PGL). Walidacja (zatwierdź / odrzuć) także z poziomu kalkulatora. Powód odrzucenia oferty przez klienta jako lista rozwijana (z opcją „Inne” i własnym tekstem). Statystyki powodów odrzucenia w panelu Analiza. Przebudowa uprawnień: konfigurowalne flowy, role, poziomy hierarchii, reguły walidacji z symulatorem i macierz widoczności (panel „Uprawnienia”). Kafelki statusów w panelu weryfikującego, kolumna PGL i marża % w zestawieniu, skrót do ustawień dla administratora, walidacja spójności pozycji oferty po stronie serwera. Oferty wysłane da się otworzyć w trybie podglądu; ofertę przegraną można renegocjować jako kolejną wersję tej samej oferty, a analityka liczy całą renegocjację jako jedną ofertę (wynik ostatniej rundy). Odpowiedzi biznesu do modelu uprawnień wdrożone: Head of Projects zastępuje N+1 i N+2, zastępstwo wyższego poziomu, wysyłka tylko przez twórcę oferty, zatwierdzenie ważne 48 h, reguła marży N+2 = 2,1% lub mniej. Widok piramidy w panelu Handlowcy pokazuje zależności: kto komu podlega i kto jest w czyim zespole.</w:t>
             </w:r>
           </w:p>
         </w:tc>
@@ -1920,6 +1920,28 @@
           <w:p>
             <w:r>
               <w:t>Panel Handlowcy: przypisanie osoby do roli w każdym flow, przełącznik Administratora, filtr po flow oraz widok piramidy (struktura organizacyjna flow: poziomy N0-N+3, NPR jako poziom równoległy, Administrator poza piramidą).</w:t>
+            </w:r>
+          </w:p>
+        </w:tc>
+      </w:tr>
+      <w:tr>
+        <w:tc>
+          <w:tcPr>
+            <w:tcW w:w="1948" w:type="dxa"/>
+          </w:tcPr>
+          <w:p>
+            <w:r>
+              <w:t>Nowa funkcja</w:t>
+            </w:r>
+          </w:p>
+        </w:tc>
+        <w:tc>
+          <w:tcPr>
+            <w:tcW w:w="6908" w:type="dxa"/>
+          </w:tcPr>
+          <w:p>
+            <w:r>
+              <w:t>Widok piramidy w panelu Handlowcy pokazuje, kto komu podlega: każda osoba to osobna karta na swoim poziomie, a linie łączą lidera zespołu z członkami jego zespołu (osoba w kilku zespołach ma kilka linii). Kliknięcie osoby podświetla całą jej ścieżkę - przełożonych w górę i zespół w dół - oraz pokazuje „Podlega: …” i liczebność zespołu. Osoby poniżej najwyższego poziomu bez lidera zespołu są oznaczone „Bez lidera zespołu”. Widok tabeli bez zmian; obsługa z klawiatury, cztery języki (PL / EN / CS / DE).</w:t>
             </w:r>
           </w:p>
         </w:tc>

</xml_diff>

<commit_message>
feat: prominent review decision bar, return to the originating list
The in-calculator approve/reject bar now has a heading ("This offer is
waiting for your decision"), the pending levels under it and large
(44px) Approve / Reject buttons with focus outlines.

Lists that open an offer in the calculator tag the URL with ?from=
(offers / senior / admin), so after a decision the reviewer returns to
the list they came from instead of always /senior (which bounced
non-senior reviewers to /calculator). Unknown origin falls back to
/offers.

Also completes edb78b9, which already carried the Calculator.tsx side
of this change (reviewReturnPath import) without its export.

v2.0 report updated.

Co-Authored-By: Claude Opus 5.5 <noreply@anthropic.com>
</commit_message>
<xml_diff>
--- a/Historia wersji oraz md/Historia wersji/AMSteel_Quote_Raport_Wersji_2.0.docx
+++ b/Historia wersji oraz md/Historia wersji/AMSteel_Quote_Raport_Wersji_2.0.docx
@@ -1804,6 +1804,28 @@
           <w:p>
             <w:r>
               <w:t>Zatwierdzenie jest ważne 48 godzin od ostatniej wymaganej zgody (liczbę godzin ustawia administrator w panelu Reguły). Po tym czasie, albo gdy reguły lub PGL zmienią się tak, że oferta wymaga wyższego poziomu, oferta ma wyraźne oznaczenie i wraca do weryfikacji przyciskiem „Wyślij do weryfikacji”. Gdy reguły się poluzowały, zatwierdzenie zostaje ważne, a oferta ma informację o zmianie reguł.</w:t>
+            </w:r>
+          </w:p>
+        </w:tc>
+      </w:tr>
+      <w:tr>
+        <w:tc>
+          <w:tcPr>
+            <w:tcW w:w="1948" w:type="dxa"/>
+          </w:tcPr>
+          <w:p>
+            <w:r>
+              <w:t>Zmiana</w:t>
+            </w:r>
+          </w:p>
+        </w:tc>
+        <w:tc>
+          <w:tcPr>
+            <w:tcW w:w="6908" w:type="dxa"/>
+          </w:tcPr>
+          <w:p>
+            <w:r>
+              <w:t>Pasek walidacji w kalkulatorze jest teraz wyraźnie widoczny: nagłówek „Ta oferta czeka na Twoją decyzję”, pod nim wymagane poziomy akceptacji oraz duże przyciski Zatwierdź / Odrzuć. Po zatwierdzeniu lub odrzuceniu kalkulator wraca do listy, z której otwarto ofertę (Moje oferty, panel weryfikującego albo Oferty w panelu administratora) - wcześniej zawsze przenosił do panelu weryfikującego.</w:t>
             </w:r>
           </w:p>
         </w:tc>

</xml_diff>

<commit_message>
feat: thousands separator in every displayed amount and tonnage
Display-only grouping (1 000 000) via lib/numberFormat.ts, applied after
rounding so the round-up of the final price is unchanged. Narrow no-break
space in the UI; the PDF uses the ASCII &nbsp; entity because the HTML ->
PDF service is external. Inputs, saved offers, API payloads and Excel/CSV
exports keep raw numbers. Analytics now groups the same way in every
language while keeping locale decimals. Dimensions in mm stay ungrouped.

Version 2.0 report updated (Interfejs i jezyki, Eksport PDF, summary).

Co-Authored-By: Claude Opus 5.5 <noreply@anthropic.com>
</commit_message>
<xml_diff>
--- a/Historia wersji oraz md/Historia wersji/AMSteel_Quote_Raport_Wersji_2.0.docx
+++ b/Historia wersji oraz md/Historia wersji/AMSteel_Quote_Raport_Wersji_2.0.docx
@@ -318,7 +318,7 @@
           </w:tcPr>
           <w:p>
             <w:r>
-              <w:t>Panel Starszego handlowca: rozwijana tabela pozycji z cenami oraz lista pozycji poniżej wytycznych (marża / PGL). Walidacja (zatwierdź / odrzuć) także z poziomu kalkulatora. Powód odrzucenia oferty przez klienta jako lista rozwijana (z opcją „Inne” i własnym tekstem). Statystyki powodów odrzucenia w panelu Analiza. Przebudowa uprawnień: konfigurowalne flowy, role, poziomy hierarchii, reguły walidacji z symulatorem i macierz widoczności (panel „Uprawnienia”). Kafelki statusów w panelu weryfikującego, kolumna PGL i marża % w zestawieniu, skrót do ustawień dla administratora, walidacja spójności pozycji oferty po stronie serwera. Oferty wysłane da się otworzyć w trybie podglądu; ofertę przegraną można renegocjować jako kolejną wersję tej samej oferty, a analityka liczy całą renegocjację jako jedną ofertę (wynik ostatniej rundy). Odpowiedzi biznesu do modelu uprawnień wdrożone: Head of Projects zastępuje N+1 i N+2, zastępstwo wyższego poziomu, wysyłka tylko przez twórcę oferty, zatwierdzenie ważne 48 h, reguła marży N+2 = 2,1% lub mniej. Widok piramidy w panelu Handlowcy pokazuje zależności: kto komu podlega i kto jest w czyim zespole. Edytowalny cennik dopłat osobno dla każdego typu stali (panel administratora, historia zmian).</w:t>
+              <w:t>Panel Starszego handlowca: rozwijana tabela pozycji z cenami oraz lista pozycji poniżej wytycznych (marża / PGL). Walidacja (zatwierdź / odrzuć) także z poziomu kalkulatora. Powód odrzucenia oferty przez klienta jako lista rozwijana (z opcją „Inne” i własnym tekstem). Statystyki powodów odrzucenia w panelu Analiza. Przebudowa uprawnień: konfigurowalne flowy, role, poziomy hierarchii, reguły walidacji z symulatorem i macierz widoczności (panel „Uprawnienia”). Kafelki statusów w panelu weryfikującego, kolumna PGL i marża % w zestawieniu, skrót do ustawień dla administratora, walidacja spójności pozycji oferty po stronie serwera. Oferty wysłane da się otworzyć w trybie podglądu; ofertę przegraną można renegocjować jako kolejną wersję tej samej oferty, a analityka liczy całą renegocjację jako jedną ofertę (wynik ostatniej rundy). Odpowiedzi biznesu do modelu uprawnień wdrożone: Head of Projects zastępuje N+1 i N+2, zastępstwo wyższego poziomu, wysyłka tylko przez twórcę oferty, zatwierdzenie ważne 48 h, reguła marży N+2 = 2,1% lub mniej. Widok piramidy w panelu Handlowcy pokazuje zależności: kto komu podlega i kto jest w czyim zespole. Edytowalny cennik dopłat osobno dla każdego typu stali (panel administratora, historia zmian). Odstęp tysięcy (1 000 000) we wszystkich kwotach i tonażach w aplikacji oraz w PDF.</w:t>
             </w:r>
           </w:p>
         </w:tc>
@@ -1921,6 +1921,28 @@
           </w:p>
         </w:tc>
       </w:tr>
+      <w:tr>
+        <w:tc>
+          <w:tcPr>
+            <w:tcW w:w="1948" w:type="dxa"/>
+          </w:tcPr>
+          <w:p>
+            <w:r>
+              <w:t>Zmiana</w:t>
+            </w:r>
+          </w:p>
+        </w:tc>
+        <w:tc>
+          <w:tcPr>
+            <w:tcW w:w="6908" w:type="dxa"/>
+          </w:tcPr>
+          <w:p>
+            <w:r>
+              <w:t>Oferta PDF: odstęp tysięcy w ilości (t), cenie za tonę, wartości pozycji oraz w łącznym tonażu i wartości oferty (np. 873 330 zł). Zwykła spacja nierozdzielna, obsługiwana przez każdą czcionkę w zewnętrznej usłudze generującej PDF.</w:t>
+            </w:r>
+          </w:p>
+        </w:tc>
+      </w:tr>
     </w:tbl>
     <w:p>
       <w:pPr>
@@ -2118,6 +2140,28 @@
           <w:p>
             <w:r>
               <w:t>Panel „Cennik dopłat” (/admin/cennik, tylko superużytkownik): zakładka dla każdego typu stali, sekcje Gatunki (wyszukiwanie, dodawanie, wycofywanie i przywracanie, dopłata Re), Opcje huty, Opcje SSC, Matryce oraz Progi. Zmienione pola są wyróżnione, zapis wysyła tylko różnice danego typu, a każda zmiana trafia do historii (kto, kiedy, stara → nowa wartość). Wejście z menu administratora, Pulpitu i Ustawień; etykiety w 4 językach.</w:t>
+            </w:r>
+          </w:p>
+        </w:tc>
+      </w:tr>
+      <w:tr>
+        <w:tc>
+          <w:tcPr>
+            <w:tcW w:w="1948" w:type="dxa"/>
+          </w:tcPr>
+          <w:p>
+            <w:r>
+              <w:t>Zmiana</w:t>
+            </w:r>
+          </w:p>
+        </w:tc>
+        <w:tc>
+          <w:tcPr>
+            <w:tcW w:w="6908" w:type="dxa"/>
+          </w:tcPr>
+          <w:p>
+            <w:r>
+              <w:t>Odstęp tysięcy we wszystkich kwotach i tonażach w aplikacji (np. 1 000 000 zamiast 1000000) - kalkulator, transport, zestawienie, listy ofert, panel weryfikującego, Analiza i Handlowcy. Wąska, nierozdzielna spacja (liczba nigdy nie łamie się między wierszami); w Analizie ten sam odstęp w każdym języku zamiast przecinków w wersji angielskiej, separator dziesiętny bez zmian. Tylko wyświetlanie: pola do wpisywania, zapis oferty, eksport do Excela/CSV i wyliczenia (w tym zaokrąglenie ceny końcowej w górę) bez zmian. Wymiary w mm zostają bez odstępów.</w:t>
             </w:r>
           </w:p>
         </w:tc>

</xml_diff>